<commit_message>
Corrección de fecha y carátula del informe final
</commit_message>
<xml_diff>
--- a/TP4/TP4_Programacion_Grupo3.docx
+++ b/TP4/TP4_Programacion_Grupo3.docx
@@ -1,6 +1,6 @@
 
 <file path=word/document.xml><?xml version="1.0" encoding="utf-8"?>
-<w:document xmlns:wpc="http://schemas.microsoft.com/office/word/2010/wordprocessingCanvas" xmlns:cx="http://schemas.microsoft.com/office/drawing/2014/chartex" xmlns:cx1="http://schemas.microsoft.com/office/drawing/2015/9/8/chartex" xmlns:cx2="http://schemas.microsoft.com/office/drawing/2015/10/21/chartex" xmlns:cx3="http://schemas.microsoft.com/office/drawing/2016/5/9/chartex" xmlns:cx4="http://schemas.microsoft.com/office/drawing/2016/5/10/chartex" xmlns:cx5="http://schemas.microsoft.com/office/drawing/2016/5/11/chartex" xmlns:cx6="http://schemas.microsoft.com/office/drawing/2016/5/12/chartex" xmlns:cx7="http://schemas.microsoft.com/office/drawing/2016/5/13/chartex" xmlns:cx8="http://schemas.microsoft.com/office/drawing/2016/5/14/chartex" xmlns:mc="http://schemas.openxmlformats.org/markup-compatibility/2006" xmlns:aink="http://schemas.microsoft.com/office/drawing/2016/ink" xmlns:am3d="http://schemas.microsoft.com/office/drawing/2017/model3d" xmlns:o="urn:schemas-microsoft-com:office:office" xmlns:r="http://schemas.openxmlformats.org/officeDocument/2006/relationships" xmlns:m="http://schemas.openxmlformats.org/officeDocument/2006/math" xmlns:v="urn:schemas-microsoft-com:vml" xmlns:wp14="http://schemas.microsoft.com/office/word/2010/wordprocessingDrawing" xmlns:wp="http://schemas.openxmlformats.org/drawingml/2006/wordprocessingDrawing" xmlns:w10="urn:schemas-microsoft-com:office:word" xmlns:w="http://schemas.openxmlformats.org/wordprocessingml/2006/main" xmlns:w14="http://schemas.microsoft.com/office/word/2010/wordml" xmlns:w15="http://schemas.microsoft.com/office/word/2012/wordml" xmlns:w16cex="http://schemas.microsoft.com/office/word/2018/wordml/cex" xmlns:w16cid="http://schemas.microsoft.com/office/word/2016/wordml/cid" xmlns:w16="http://schemas.microsoft.com/office/word/2018/wordml" xmlns:w16sdtdh="http://schemas.microsoft.com/office/word/2020/wordml/sdtdatahash" xmlns:w16se="http://schemas.microsoft.com/office/word/2015/wordml/symex" xmlns:wpg="http://schemas.microsoft.com/office/word/2010/wordprocessingGroup" xmlns:wpi="http://schemas.microsoft.com/office/word/2010/wordprocessingInk" xmlns:wne="http://schemas.microsoft.com/office/word/2006/wordml" xmlns:wps="http://schemas.microsoft.com/office/word/2010/wordprocessingShape" mc:Ignorable="w14 w15 w16se w16cid w16 w16cex w16sdtdh wp14">
+<w:document xmlns:wpc="http://schemas.microsoft.com/office/word/2010/wordprocessingCanvas" xmlns:cx="http://schemas.microsoft.com/office/drawing/2014/chartex" xmlns:cx1="http://schemas.microsoft.com/office/drawing/2015/9/8/chartex" xmlns:cx2="http://schemas.microsoft.com/office/drawing/2015/10/21/chartex" xmlns:cx3="http://schemas.microsoft.com/office/drawing/2016/5/9/chartex" xmlns:cx4="http://schemas.microsoft.com/office/drawing/2016/5/10/chartex" xmlns:cx5="http://schemas.microsoft.com/office/drawing/2016/5/11/chartex" xmlns:cx6="http://schemas.microsoft.com/office/drawing/2016/5/12/chartex" xmlns:cx7="http://schemas.microsoft.com/office/drawing/2016/5/13/chartex" xmlns:cx8="http://schemas.microsoft.com/office/drawing/2016/5/14/chartex" xmlns:mc="http://schemas.openxmlformats.org/markup-compatibility/2006" xmlns:aink="http://schemas.microsoft.com/office/drawing/2016/ink" xmlns:am3d="http://schemas.microsoft.com/office/drawing/2017/model3d" xmlns:o="urn:schemas-microsoft-com:office:office" xmlns:oel="http://schemas.microsoft.com/office/2019/extlst" xmlns:r="http://schemas.openxmlformats.org/officeDocument/2006/relationships" xmlns:m="http://schemas.openxmlformats.org/officeDocument/2006/math" xmlns:v="urn:schemas-microsoft-com:vml" xmlns:wp14="http://schemas.microsoft.com/office/word/2010/wordprocessingDrawing" xmlns:wp="http://schemas.openxmlformats.org/drawingml/2006/wordprocessingDrawing" xmlns:w10="urn:schemas-microsoft-com:office:word" xmlns:w="http://schemas.openxmlformats.org/wordprocessingml/2006/main" xmlns:w14="http://schemas.microsoft.com/office/word/2010/wordml" xmlns:w15="http://schemas.microsoft.com/office/word/2012/wordml" xmlns:w16cex="http://schemas.microsoft.com/office/word/2018/wordml/cex" xmlns:w16cid="http://schemas.microsoft.com/office/word/2016/wordml/cid" xmlns:w16="http://schemas.microsoft.com/office/word/2018/wordml" xmlns:w16du="http://schemas.microsoft.com/office/word/2023/wordml/word16du" xmlns:w16sdtdh="http://schemas.microsoft.com/office/word/2020/wordml/sdtdatahash" xmlns:w16sdtfl="http://schemas.microsoft.com/office/word/2024/wordml/sdtformatlock" xmlns:w16se="http://schemas.microsoft.com/office/word/2015/wordml/symex" xmlns:wpg="http://schemas.microsoft.com/office/word/2010/wordprocessingGroup" xmlns:wpi="http://schemas.microsoft.com/office/word/2010/wordprocessingInk" xmlns:wne="http://schemas.microsoft.com/office/word/2006/wordml" xmlns:wps="http://schemas.microsoft.com/office/word/2010/wordprocessingShape" mc:Ignorable="w14 w15 w16se w16cid w16 w16cex w16sdtdh w16sdtfl w16du wp14">
   <w:body>
     <w:p>
       <w:pPr>
@@ -212,7 +212,7 @@
           <w:szCs w:val="36"/>
           <w:lang w:val="es-ES_tradnl"/>
         </w:rPr>
-        <w:t>Tercer</w:t>
+        <w:t>Cuarto</w:t>
       </w:r>
       <w:r>
         <w:rPr>
@@ -629,7 +629,7 @@
           <w:szCs w:val="32"/>
           <w:lang w:val="es-ES_tradnl"/>
         </w:rPr>
-        <w:t>Agosto</w:t>
+        <w:t>Septiembre</w:t>
       </w:r>
       <w:r>
         <w:rPr>
@@ -675,6 +675,13 @@
     </w:p>
     <w:p>
       <w:pPr>
+        <w:rPr>
+          <w:lang w:val="es-US"/>
+        </w:rPr>
+      </w:pPr>
+    </w:p>
+    <w:p>
+      <w:pPr>
         <w:pStyle w:val="Ttulo1"/>
         <w:rPr>
           <w:lang w:val="es-US"/>
@@ -689,6 +696,13 @@
     </w:p>
     <w:p>
       <w:pPr>
+        <w:rPr>
+          <w:lang w:val="es-US"/>
+        </w:rPr>
+      </w:pPr>
+    </w:p>
+    <w:p>
+      <w:pPr>
         <w:pStyle w:val="Ttulo1"/>
         <w:rPr>
           <w:lang w:val="es-US"/>
@@ -703,6 +717,13 @@
     </w:p>
     <w:p>
       <w:pPr>
+        <w:rPr>
+          <w:lang w:val="es-US"/>
+        </w:rPr>
+      </w:pPr>
+    </w:p>
+    <w:p>
+      <w:pPr>
         <w:pStyle w:val="Ttulo1"/>
         <w:rPr>
           <w:lang w:val="es-US"/>
@@ -714,13 +735,6 @@
         </w:rPr>
         <w:t>Herramientas de la IA y reflexión final</w:t>
       </w:r>
-    </w:p>
-    <w:p>
-      <w:pPr>
-        <w:rPr>
-          <w:lang w:val="es-US"/>
-        </w:rPr>
-      </w:pPr>
     </w:p>
     <w:p>
       <w:pPr>
@@ -756,7 +770,6 @@
           <w:docPart w:val="DefaultPlaceholder_-1854013440"/>
         </w:placeholder>
       </w:sdtPr>
-      <w:sdtEndPr/>
       <w:sdtContent>
         <w:p>
           <w:pPr>
@@ -866,23 +879,7 @@
               <w:rFonts w:eastAsia="Times New Roman" w:cs="Times New Roman"/>
               <w:color w:val="000000"/>
             </w:rPr>
-            <w:t xml:space="preserve"> </w:t>
-          </w:r>
-          <w:proofErr w:type="spellStart"/>
-          <w:r>
-            <w:rPr>
-              <w:rFonts w:eastAsia="Times New Roman" w:cs="Times New Roman"/>
-              <w:color w:val="000000"/>
-            </w:rPr>
-            <w:t>Nations</w:t>
-          </w:r>
-          <w:proofErr w:type="spellEnd"/>
-          <w:r>
-            <w:rPr>
-              <w:rFonts w:eastAsia="Times New Roman" w:cs="Times New Roman"/>
-              <w:color w:val="000000"/>
-            </w:rPr>
-            <w:t>. https://doi.org/10.35188/UNU-WIDER/2021/953-2</w:t>
+            <w:t xml:space="preserve"> Nations. https://doi.org/10.35188/UNU-WIDER/2021/953-2</w:t>
           </w:r>
         </w:p>
         <w:p>
@@ -946,7 +943,7 @@
 </file>
 
 <file path=word/endnotes.xml><?xml version="1.0" encoding="utf-8"?>
-<w:endnotes xmlns:wpc="http://schemas.microsoft.com/office/word/2010/wordprocessingCanvas" xmlns:cx="http://schemas.microsoft.com/office/drawing/2014/chartex" xmlns:cx1="http://schemas.microsoft.com/office/drawing/2015/9/8/chartex" xmlns:cx2="http://schemas.microsoft.com/office/drawing/2015/10/21/chartex" xmlns:cx3="http://schemas.microsoft.com/office/drawing/2016/5/9/chartex" xmlns:cx4="http://schemas.microsoft.com/office/drawing/2016/5/10/chartex" xmlns:cx5="http://schemas.microsoft.com/office/drawing/2016/5/11/chartex" xmlns:cx6="http://schemas.microsoft.com/office/drawing/2016/5/12/chartex" xmlns:cx7="http://schemas.microsoft.com/office/drawing/2016/5/13/chartex" xmlns:cx8="http://schemas.microsoft.com/office/drawing/2016/5/14/chartex" xmlns:mc="http://schemas.openxmlformats.org/markup-compatibility/2006" xmlns:aink="http://schemas.microsoft.com/office/drawing/2016/ink" xmlns:am3d="http://schemas.microsoft.com/office/drawing/2017/model3d" xmlns:o="urn:schemas-microsoft-com:office:office" xmlns:r="http://schemas.openxmlformats.org/officeDocument/2006/relationships" xmlns:m="http://schemas.openxmlformats.org/officeDocument/2006/math" xmlns:v="urn:schemas-microsoft-com:vml" xmlns:wp14="http://schemas.microsoft.com/office/word/2010/wordprocessingDrawing" xmlns:wp="http://schemas.openxmlformats.org/drawingml/2006/wordprocessingDrawing" xmlns:w10="urn:schemas-microsoft-com:office:word" xmlns:w="http://schemas.openxmlformats.org/wordprocessingml/2006/main" xmlns:w14="http://schemas.microsoft.com/office/word/2010/wordml" xmlns:w15="http://schemas.microsoft.com/office/word/2012/wordml" xmlns:w16cex="http://schemas.microsoft.com/office/word/2018/wordml/cex" xmlns:w16cid="http://schemas.microsoft.com/office/word/2016/wordml/cid" xmlns:w16="http://schemas.microsoft.com/office/word/2018/wordml" xmlns:w16sdtdh="http://schemas.microsoft.com/office/word/2020/wordml/sdtdatahash" xmlns:w16se="http://schemas.microsoft.com/office/word/2015/wordml/symex" xmlns:wpg="http://schemas.microsoft.com/office/word/2010/wordprocessingGroup" xmlns:wpi="http://schemas.microsoft.com/office/word/2010/wordprocessingInk" xmlns:wne="http://schemas.microsoft.com/office/word/2006/wordml" xmlns:wps="http://schemas.microsoft.com/office/word/2010/wordprocessingShape" mc:Ignorable="w14 w15 w16se w16cid w16 w16cex w16sdtdh wp14">
+<w:endnotes xmlns:wpc="http://schemas.microsoft.com/office/word/2010/wordprocessingCanvas" xmlns:cx="http://schemas.microsoft.com/office/drawing/2014/chartex" xmlns:cx1="http://schemas.microsoft.com/office/drawing/2015/9/8/chartex" xmlns:cx2="http://schemas.microsoft.com/office/drawing/2015/10/21/chartex" xmlns:cx3="http://schemas.microsoft.com/office/drawing/2016/5/9/chartex" xmlns:cx4="http://schemas.microsoft.com/office/drawing/2016/5/10/chartex" xmlns:cx5="http://schemas.microsoft.com/office/drawing/2016/5/11/chartex" xmlns:cx6="http://schemas.microsoft.com/office/drawing/2016/5/12/chartex" xmlns:cx7="http://schemas.microsoft.com/office/drawing/2016/5/13/chartex" xmlns:cx8="http://schemas.microsoft.com/office/drawing/2016/5/14/chartex" xmlns:mc="http://schemas.openxmlformats.org/markup-compatibility/2006" xmlns:aink="http://schemas.microsoft.com/office/drawing/2016/ink" xmlns:am3d="http://schemas.microsoft.com/office/drawing/2017/model3d" xmlns:o="urn:schemas-microsoft-com:office:office" xmlns:oel="http://schemas.microsoft.com/office/2019/extlst" xmlns:r="http://schemas.openxmlformats.org/officeDocument/2006/relationships" xmlns:m="http://schemas.openxmlformats.org/officeDocument/2006/math" xmlns:v="urn:schemas-microsoft-com:vml" xmlns:wp14="http://schemas.microsoft.com/office/word/2010/wordprocessingDrawing" xmlns:wp="http://schemas.openxmlformats.org/drawingml/2006/wordprocessingDrawing" xmlns:w10="urn:schemas-microsoft-com:office:word" xmlns:w="http://schemas.openxmlformats.org/wordprocessingml/2006/main" xmlns:w14="http://schemas.microsoft.com/office/word/2010/wordml" xmlns:w15="http://schemas.microsoft.com/office/word/2012/wordml" xmlns:w16cex="http://schemas.microsoft.com/office/word/2018/wordml/cex" xmlns:w16cid="http://schemas.microsoft.com/office/word/2016/wordml/cid" xmlns:w16="http://schemas.microsoft.com/office/word/2018/wordml" xmlns:w16du="http://schemas.microsoft.com/office/word/2023/wordml/word16du" xmlns:w16sdtdh="http://schemas.microsoft.com/office/word/2020/wordml/sdtdatahash" xmlns:w16sdtfl="http://schemas.microsoft.com/office/word/2024/wordml/sdtformatlock" xmlns:w16se="http://schemas.microsoft.com/office/word/2015/wordml/symex" xmlns:wpg="http://schemas.microsoft.com/office/word/2010/wordprocessingGroup" xmlns:wpi="http://schemas.microsoft.com/office/word/2010/wordprocessingInk" xmlns:wne="http://schemas.microsoft.com/office/word/2006/wordml" xmlns:wps="http://schemas.microsoft.com/office/word/2010/wordprocessingShape" mc:Ignorable="w14 w15 w16se w16cid w16 w16cex w16sdtdh w16sdtfl w16du wp14">
   <w:endnote w:type="separator" w:id="-1">
     <w:p>
       <w:pPr>
@@ -971,7 +968,7 @@
 </file>
 
 <file path=word/footer1.xml><?xml version="1.0" encoding="utf-8"?>
-<w:ftr xmlns:wpc="http://schemas.microsoft.com/office/word/2010/wordprocessingCanvas" xmlns:cx="http://schemas.microsoft.com/office/drawing/2014/chartex" xmlns:cx1="http://schemas.microsoft.com/office/drawing/2015/9/8/chartex" xmlns:cx2="http://schemas.microsoft.com/office/drawing/2015/10/21/chartex" xmlns:cx3="http://schemas.microsoft.com/office/drawing/2016/5/9/chartex" xmlns:cx4="http://schemas.microsoft.com/office/drawing/2016/5/10/chartex" xmlns:cx5="http://schemas.microsoft.com/office/drawing/2016/5/11/chartex" xmlns:cx6="http://schemas.microsoft.com/office/drawing/2016/5/12/chartex" xmlns:cx7="http://schemas.microsoft.com/office/drawing/2016/5/13/chartex" xmlns:cx8="http://schemas.microsoft.com/office/drawing/2016/5/14/chartex" xmlns:mc="http://schemas.openxmlformats.org/markup-compatibility/2006" xmlns:aink="http://schemas.microsoft.com/office/drawing/2016/ink" xmlns:am3d="http://schemas.microsoft.com/office/drawing/2017/model3d" xmlns:o="urn:schemas-microsoft-com:office:office" xmlns:r="http://schemas.openxmlformats.org/officeDocument/2006/relationships" xmlns:m="http://schemas.openxmlformats.org/officeDocument/2006/math" xmlns:v="urn:schemas-microsoft-com:vml" xmlns:wp14="http://schemas.microsoft.com/office/word/2010/wordprocessingDrawing" xmlns:wp="http://schemas.openxmlformats.org/drawingml/2006/wordprocessingDrawing" xmlns:w10="urn:schemas-microsoft-com:office:word" xmlns:w="http://schemas.openxmlformats.org/wordprocessingml/2006/main" xmlns:w14="http://schemas.microsoft.com/office/word/2010/wordml" xmlns:w15="http://schemas.microsoft.com/office/word/2012/wordml" xmlns:w16cex="http://schemas.microsoft.com/office/word/2018/wordml/cex" xmlns:w16cid="http://schemas.microsoft.com/office/word/2016/wordml/cid" xmlns:w16="http://schemas.microsoft.com/office/word/2018/wordml" xmlns:w16sdtdh="http://schemas.microsoft.com/office/word/2020/wordml/sdtdatahash" xmlns:w16se="http://schemas.microsoft.com/office/word/2015/wordml/symex" xmlns:wpg="http://schemas.microsoft.com/office/word/2010/wordprocessingGroup" xmlns:wpi="http://schemas.microsoft.com/office/word/2010/wordprocessingInk" xmlns:wne="http://schemas.microsoft.com/office/word/2006/wordml" xmlns:wps="http://schemas.microsoft.com/office/word/2010/wordprocessingShape" mc:Ignorable="w14 w15 w16se w16cid w16 w16cex w16sdtdh wp14">
+<w:ftr xmlns:wpc="http://schemas.microsoft.com/office/word/2010/wordprocessingCanvas" xmlns:cx="http://schemas.microsoft.com/office/drawing/2014/chartex" xmlns:cx1="http://schemas.microsoft.com/office/drawing/2015/9/8/chartex" xmlns:cx2="http://schemas.microsoft.com/office/drawing/2015/10/21/chartex" xmlns:cx3="http://schemas.microsoft.com/office/drawing/2016/5/9/chartex" xmlns:cx4="http://schemas.microsoft.com/office/drawing/2016/5/10/chartex" xmlns:cx5="http://schemas.microsoft.com/office/drawing/2016/5/11/chartex" xmlns:cx6="http://schemas.microsoft.com/office/drawing/2016/5/12/chartex" xmlns:cx7="http://schemas.microsoft.com/office/drawing/2016/5/13/chartex" xmlns:cx8="http://schemas.microsoft.com/office/drawing/2016/5/14/chartex" xmlns:mc="http://schemas.openxmlformats.org/markup-compatibility/2006" xmlns:aink="http://schemas.microsoft.com/office/drawing/2016/ink" xmlns:am3d="http://schemas.microsoft.com/office/drawing/2017/model3d" xmlns:o="urn:schemas-microsoft-com:office:office" xmlns:oel="http://schemas.microsoft.com/office/2019/extlst" xmlns:r="http://schemas.openxmlformats.org/officeDocument/2006/relationships" xmlns:m="http://schemas.openxmlformats.org/officeDocument/2006/math" xmlns:v="urn:schemas-microsoft-com:vml" xmlns:wp14="http://schemas.microsoft.com/office/word/2010/wordprocessingDrawing" xmlns:wp="http://schemas.openxmlformats.org/drawingml/2006/wordprocessingDrawing" xmlns:w10="urn:schemas-microsoft-com:office:word" xmlns:w="http://schemas.openxmlformats.org/wordprocessingml/2006/main" xmlns:w14="http://schemas.microsoft.com/office/word/2010/wordml" xmlns:w15="http://schemas.microsoft.com/office/word/2012/wordml" xmlns:w16cex="http://schemas.microsoft.com/office/word/2018/wordml/cex" xmlns:w16cid="http://schemas.microsoft.com/office/word/2016/wordml/cid" xmlns:w16="http://schemas.microsoft.com/office/word/2018/wordml" xmlns:w16du="http://schemas.microsoft.com/office/word/2023/wordml/word16du" xmlns:w16sdtdh="http://schemas.microsoft.com/office/word/2020/wordml/sdtdatahash" xmlns:w16sdtfl="http://schemas.microsoft.com/office/word/2024/wordml/sdtformatlock" xmlns:w16se="http://schemas.microsoft.com/office/word/2015/wordml/symex" xmlns:wpg="http://schemas.microsoft.com/office/word/2010/wordprocessingGroup" xmlns:wpi="http://schemas.microsoft.com/office/word/2010/wordprocessingInk" xmlns:wne="http://schemas.microsoft.com/office/word/2006/wordml" xmlns:wps="http://schemas.microsoft.com/office/word/2010/wordprocessingShape" mc:Ignorable="w14 w15 w16se w16cid w16 w16cex w16sdtdh w16sdtfl w16du wp14">
   <w:sdt>
     <w:sdtPr>
       <w:rPr>
@@ -983,11 +980,6 @@
         <w:docPartUnique/>
       </w:docPartObj>
     </w:sdtPr>
-    <w:sdtEndPr>
-      <w:rPr>
-        <w:rStyle w:val="Nmerodepgina"/>
-      </w:rPr>
-    </w:sdtEndPr>
     <w:sdtContent>
       <w:p>
         <w:pPr>
@@ -1033,7 +1025,7 @@
 </file>
 
 <file path=word/footer2.xml><?xml version="1.0" encoding="utf-8"?>
-<w:ftr xmlns:wpc="http://schemas.microsoft.com/office/word/2010/wordprocessingCanvas" xmlns:cx="http://schemas.microsoft.com/office/drawing/2014/chartex" xmlns:cx1="http://schemas.microsoft.com/office/drawing/2015/9/8/chartex" xmlns:cx2="http://schemas.microsoft.com/office/drawing/2015/10/21/chartex" xmlns:cx3="http://schemas.microsoft.com/office/drawing/2016/5/9/chartex" xmlns:cx4="http://schemas.microsoft.com/office/drawing/2016/5/10/chartex" xmlns:cx5="http://schemas.microsoft.com/office/drawing/2016/5/11/chartex" xmlns:cx6="http://schemas.microsoft.com/office/drawing/2016/5/12/chartex" xmlns:cx7="http://schemas.microsoft.com/office/drawing/2016/5/13/chartex" xmlns:cx8="http://schemas.microsoft.com/office/drawing/2016/5/14/chartex" xmlns:mc="http://schemas.openxmlformats.org/markup-compatibility/2006" xmlns:aink="http://schemas.microsoft.com/office/drawing/2016/ink" xmlns:am3d="http://schemas.microsoft.com/office/drawing/2017/model3d" xmlns:o="urn:schemas-microsoft-com:office:office" xmlns:r="http://schemas.openxmlformats.org/officeDocument/2006/relationships" xmlns:m="http://schemas.openxmlformats.org/officeDocument/2006/math" xmlns:v="urn:schemas-microsoft-com:vml" xmlns:wp14="http://schemas.microsoft.com/office/word/2010/wordprocessingDrawing" xmlns:wp="http://schemas.openxmlformats.org/drawingml/2006/wordprocessingDrawing" xmlns:w10="urn:schemas-microsoft-com:office:word" xmlns:w="http://schemas.openxmlformats.org/wordprocessingml/2006/main" xmlns:w14="http://schemas.microsoft.com/office/word/2010/wordml" xmlns:w15="http://schemas.microsoft.com/office/word/2012/wordml" xmlns:w16cex="http://schemas.microsoft.com/office/word/2018/wordml/cex" xmlns:w16cid="http://schemas.microsoft.com/office/word/2016/wordml/cid" xmlns:w16="http://schemas.microsoft.com/office/word/2018/wordml" xmlns:w16sdtdh="http://schemas.microsoft.com/office/word/2020/wordml/sdtdatahash" xmlns:w16se="http://schemas.microsoft.com/office/word/2015/wordml/symex" xmlns:wpg="http://schemas.microsoft.com/office/word/2010/wordprocessingGroup" xmlns:wpi="http://schemas.microsoft.com/office/word/2010/wordprocessingInk" xmlns:wne="http://schemas.microsoft.com/office/word/2006/wordml" xmlns:wps="http://schemas.microsoft.com/office/word/2010/wordprocessingShape" mc:Ignorable="w14 w15 w16se w16cid w16 w16cex w16sdtdh wp14">
+<w:ftr xmlns:wpc="http://schemas.microsoft.com/office/word/2010/wordprocessingCanvas" xmlns:cx="http://schemas.microsoft.com/office/drawing/2014/chartex" xmlns:cx1="http://schemas.microsoft.com/office/drawing/2015/9/8/chartex" xmlns:cx2="http://schemas.microsoft.com/office/drawing/2015/10/21/chartex" xmlns:cx3="http://schemas.microsoft.com/office/drawing/2016/5/9/chartex" xmlns:cx4="http://schemas.microsoft.com/office/drawing/2016/5/10/chartex" xmlns:cx5="http://schemas.microsoft.com/office/drawing/2016/5/11/chartex" xmlns:cx6="http://schemas.microsoft.com/office/drawing/2016/5/12/chartex" xmlns:cx7="http://schemas.microsoft.com/office/drawing/2016/5/13/chartex" xmlns:cx8="http://schemas.microsoft.com/office/drawing/2016/5/14/chartex" xmlns:mc="http://schemas.openxmlformats.org/markup-compatibility/2006" xmlns:aink="http://schemas.microsoft.com/office/drawing/2016/ink" xmlns:am3d="http://schemas.microsoft.com/office/drawing/2017/model3d" xmlns:o="urn:schemas-microsoft-com:office:office" xmlns:oel="http://schemas.microsoft.com/office/2019/extlst" xmlns:r="http://schemas.openxmlformats.org/officeDocument/2006/relationships" xmlns:m="http://schemas.openxmlformats.org/officeDocument/2006/math" xmlns:v="urn:schemas-microsoft-com:vml" xmlns:wp14="http://schemas.microsoft.com/office/word/2010/wordprocessingDrawing" xmlns:wp="http://schemas.openxmlformats.org/drawingml/2006/wordprocessingDrawing" xmlns:w10="urn:schemas-microsoft-com:office:word" xmlns:w="http://schemas.openxmlformats.org/wordprocessingml/2006/main" xmlns:w14="http://schemas.microsoft.com/office/word/2010/wordml" xmlns:w15="http://schemas.microsoft.com/office/word/2012/wordml" xmlns:w16cex="http://schemas.microsoft.com/office/word/2018/wordml/cex" xmlns:w16cid="http://schemas.microsoft.com/office/word/2016/wordml/cid" xmlns:w16="http://schemas.microsoft.com/office/word/2018/wordml" xmlns:w16du="http://schemas.microsoft.com/office/word/2023/wordml/word16du" xmlns:w16sdtdh="http://schemas.microsoft.com/office/word/2020/wordml/sdtdatahash" xmlns:w16sdtfl="http://schemas.microsoft.com/office/word/2024/wordml/sdtformatlock" xmlns:w16se="http://schemas.microsoft.com/office/word/2015/wordml/symex" xmlns:wpg="http://schemas.microsoft.com/office/word/2010/wordprocessingGroup" xmlns:wpi="http://schemas.microsoft.com/office/word/2010/wordprocessingInk" xmlns:wne="http://schemas.microsoft.com/office/word/2006/wordml" xmlns:wps="http://schemas.microsoft.com/office/word/2010/wordprocessingShape" mc:Ignorable="w14 w15 w16se w16cid w16 w16cex w16sdtdh w16sdtfl w16du wp14">
   <w:p>
     <w:pPr>
       <w:pStyle w:val="Piedepgina"/>
@@ -1052,7 +1044,7 @@
 </file>
 
 <file path=word/footer3.xml><?xml version="1.0" encoding="utf-8"?>
-<w:ftr xmlns:wpc="http://schemas.microsoft.com/office/word/2010/wordprocessingCanvas" xmlns:cx="http://schemas.microsoft.com/office/drawing/2014/chartex" xmlns:cx1="http://schemas.microsoft.com/office/drawing/2015/9/8/chartex" xmlns:cx2="http://schemas.microsoft.com/office/drawing/2015/10/21/chartex" xmlns:cx3="http://schemas.microsoft.com/office/drawing/2016/5/9/chartex" xmlns:cx4="http://schemas.microsoft.com/office/drawing/2016/5/10/chartex" xmlns:cx5="http://schemas.microsoft.com/office/drawing/2016/5/11/chartex" xmlns:cx6="http://schemas.microsoft.com/office/drawing/2016/5/12/chartex" xmlns:cx7="http://schemas.microsoft.com/office/drawing/2016/5/13/chartex" xmlns:cx8="http://schemas.microsoft.com/office/drawing/2016/5/14/chartex" xmlns:mc="http://schemas.openxmlformats.org/markup-compatibility/2006" xmlns:aink="http://schemas.microsoft.com/office/drawing/2016/ink" xmlns:am3d="http://schemas.microsoft.com/office/drawing/2017/model3d" xmlns:o="urn:schemas-microsoft-com:office:office" xmlns:r="http://schemas.openxmlformats.org/officeDocument/2006/relationships" xmlns:m="http://schemas.openxmlformats.org/officeDocument/2006/math" xmlns:v="urn:schemas-microsoft-com:vml" xmlns:wp14="http://schemas.microsoft.com/office/word/2010/wordprocessingDrawing" xmlns:wp="http://schemas.openxmlformats.org/drawingml/2006/wordprocessingDrawing" xmlns:w10="urn:schemas-microsoft-com:office:word" xmlns:w="http://schemas.openxmlformats.org/wordprocessingml/2006/main" xmlns:w14="http://schemas.microsoft.com/office/word/2010/wordml" xmlns:w15="http://schemas.microsoft.com/office/word/2012/wordml" xmlns:w16cex="http://schemas.microsoft.com/office/word/2018/wordml/cex" xmlns:w16cid="http://schemas.microsoft.com/office/word/2016/wordml/cid" xmlns:w16="http://schemas.microsoft.com/office/word/2018/wordml" xmlns:w16sdtdh="http://schemas.microsoft.com/office/word/2020/wordml/sdtdatahash" xmlns:w16se="http://schemas.microsoft.com/office/word/2015/wordml/symex" xmlns:wpg="http://schemas.microsoft.com/office/word/2010/wordprocessingGroup" xmlns:wpi="http://schemas.microsoft.com/office/word/2010/wordprocessingInk" xmlns:wne="http://schemas.microsoft.com/office/word/2006/wordml" xmlns:wps="http://schemas.microsoft.com/office/word/2010/wordprocessingShape" mc:Ignorable="w14 w15 w16se w16cid w16 w16cex w16sdtdh wp14">
+<w:ftr xmlns:wpc="http://schemas.microsoft.com/office/word/2010/wordprocessingCanvas" xmlns:cx="http://schemas.microsoft.com/office/drawing/2014/chartex" xmlns:cx1="http://schemas.microsoft.com/office/drawing/2015/9/8/chartex" xmlns:cx2="http://schemas.microsoft.com/office/drawing/2015/10/21/chartex" xmlns:cx3="http://schemas.microsoft.com/office/drawing/2016/5/9/chartex" xmlns:cx4="http://schemas.microsoft.com/office/drawing/2016/5/10/chartex" xmlns:cx5="http://schemas.microsoft.com/office/drawing/2016/5/11/chartex" xmlns:cx6="http://schemas.microsoft.com/office/drawing/2016/5/12/chartex" xmlns:cx7="http://schemas.microsoft.com/office/drawing/2016/5/13/chartex" xmlns:cx8="http://schemas.microsoft.com/office/drawing/2016/5/14/chartex" xmlns:mc="http://schemas.openxmlformats.org/markup-compatibility/2006" xmlns:aink="http://schemas.microsoft.com/office/drawing/2016/ink" xmlns:am3d="http://schemas.microsoft.com/office/drawing/2017/model3d" xmlns:o="urn:schemas-microsoft-com:office:office" xmlns:oel="http://schemas.microsoft.com/office/2019/extlst" xmlns:r="http://schemas.openxmlformats.org/officeDocument/2006/relationships" xmlns:m="http://schemas.openxmlformats.org/officeDocument/2006/math" xmlns:v="urn:schemas-microsoft-com:vml" xmlns:wp14="http://schemas.microsoft.com/office/word/2010/wordprocessingDrawing" xmlns:wp="http://schemas.openxmlformats.org/drawingml/2006/wordprocessingDrawing" xmlns:w10="urn:schemas-microsoft-com:office:word" xmlns:w="http://schemas.openxmlformats.org/wordprocessingml/2006/main" xmlns:w14="http://schemas.microsoft.com/office/word/2010/wordml" xmlns:w15="http://schemas.microsoft.com/office/word/2012/wordml" xmlns:w16cex="http://schemas.microsoft.com/office/word/2018/wordml/cex" xmlns:w16cid="http://schemas.microsoft.com/office/word/2016/wordml/cid" xmlns:w16="http://schemas.microsoft.com/office/word/2018/wordml" xmlns:w16du="http://schemas.microsoft.com/office/word/2023/wordml/word16du" xmlns:w16sdtdh="http://schemas.microsoft.com/office/word/2020/wordml/sdtdatahash" xmlns:w16sdtfl="http://schemas.microsoft.com/office/word/2024/wordml/sdtformatlock" xmlns:w16se="http://schemas.microsoft.com/office/word/2015/wordml/symex" xmlns:wpg="http://schemas.microsoft.com/office/word/2010/wordprocessingGroup" xmlns:wpi="http://schemas.microsoft.com/office/word/2010/wordprocessingInk" xmlns:wne="http://schemas.microsoft.com/office/word/2006/wordml" xmlns:wps="http://schemas.microsoft.com/office/word/2010/wordprocessingShape" mc:Ignorable="w14 w15 w16se w16cid w16 w16cex w16sdtdh w16sdtfl w16du wp14">
   <w:sdt>
     <w:sdtPr>
       <w:rPr>
@@ -1064,11 +1056,6 @@
         <w:docPartUnique/>
       </w:docPartObj>
     </w:sdtPr>
-    <w:sdtEndPr>
-      <w:rPr>
-        <w:rStyle w:val="Nmerodepgina"/>
-      </w:rPr>
-    </w:sdtEndPr>
     <w:sdtContent>
       <w:p>
         <w:pPr>
@@ -1121,7 +1108,7 @@
 </file>
 
 <file path=word/footnotes.xml><?xml version="1.0" encoding="utf-8"?>
-<w:footnotes xmlns:wpc="http://schemas.microsoft.com/office/word/2010/wordprocessingCanvas" xmlns:cx="http://schemas.microsoft.com/office/drawing/2014/chartex" xmlns:cx1="http://schemas.microsoft.com/office/drawing/2015/9/8/chartex" xmlns:cx2="http://schemas.microsoft.com/office/drawing/2015/10/21/chartex" xmlns:cx3="http://schemas.microsoft.com/office/drawing/2016/5/9/chartex" xmlns:cx4="http://schemas.microsoft.com/office/drawing/2016/5/10/chartex" xmlns:cx5="http://schemas.microsoft.com/office/drawing/2016/5/11/chartex" xmlns:cx6="http://schemas.microsoft.com/office/drawing/2016/5/12/chartex" xmlns:cx7="http://schemas.microsoft.com/office/drawing/2016/5/13/chartex" xmlns:cx8="http://schemas.microsoft.com/office/drawing/2016/5/14/chartex" xmlns:mc="http://schemas.openxmlformats.org/markup-compatibility/2006" xmlns:aink="http://schemas.microsoft.com/office/drawing/2016/ink" xmlns:am3d="http://schemas.microsoft.com/office/drawing/2017/model3d" xmlns:o="urn:schemas-microsoft-com:office:office" xmlns:r="http://schemas.openxmlformats.org/officeDocument/2006/relationships" xmlns:m="http://schemas.openxmlformats.org/officeDocument/2006/math" xmlns:v="urn:schemas-microsoft-com:vml" xmlns:wp14="http://schemas.microsoft.com/office/word/2010/wordprocessingDrawing" xmlns:wp="http://schemas.openxmlformats.org/drawingml/2006/wordprocessingDrawing" xmlns:w10="urn:schemas-microsoft-com:office:word" xmlns:w="http://schemas.openxmlformats.org/wordprocessingml/2006/main" xmlns:w14="http://schemas.microsoft.com/office/word/2010/wordml" xmlns:w15="http://schemas.microsoft.com/office/word/2012/wordml" xmlns:w16cex="http://schemas.microsoft.com/office/word/2018/wordml/cex" xmlns:w16cid="http://schemas.microsoft.com/office/word/2016/wordml/cid" xmlns:w16="http://schemas.microsoft.com/office/word/2018/wordml" xmlns:w16sdtdh="http://schemas.microsoft.com/office/word/2020/wordml/sdtdatahash" xmlns:w16se="http://schemas.microsoft.com/office/word/2015/wordml/symex" xmlns:wpg="http://schemas.microsoft.com/office/word/2010/wordprocessingGroup" xmlns:wpi="http://schemas.microsoft.com/office/word/2010/wordprocessingInk" xmlns:wne="http://schemas.microsoft.com/office/word/2006/wordml" xmlns:wps="http://schemas.microsoft.com/office/word/2010/wordprocessingShape" mc:Ignorable="w14 w15 w16se w16cid w16 w16cex w16sdtdh wp14">
+<w:footnotes xmlns:wpc="http://schemas.microsoft.com/office/word/2010/wordprocessingCanvas" xmlns:cx="http://schemas.microsoft.com/office/drawing/2014/chartex" xmlns:cx1="http://schemas.microsoft.com/office/drawing/2015/9/8/chartex" xmlns:cx2="http://schemas.microsoft.com/office/drawing/2015/10/21/chartex" xmlns:cx3="http://schemas.microsoft.com/office/drawing/2016/5/9/chartex" xmlns:cx4="http://schemas.microsoft.com/office/drawing/2016/5/10/chartex" xmlns:cx5="http://schemas.microsoft.com/office/drawing/2016/5/11/chartex" xmlns:cx6="http://schemas.microsoft.com/office/drawing/2016/5/12/chartex" xmlns:cx7="http://schemas.microsoft.com/office/drawing/2016/5/13/chartex" xmlns:cx8="http://schemas.microsoft.com/office/drawing/2016/5/14/chartex" xmlns:mc="http://schemas.openxmlformats.org/markup-compatibility/2006" xmlns:aink="http://schemas.microsoft.com/office/drawing/2016/ink" xmlns:am3d="http://schemas.microsoft.com/office/drawing/2017/model3d" xmlns:o="urn:schemas-microsoft-com:office:office" xmlns:oel="http://schemas.microsoft.com/office/2019/extlst" xmlns:r="http://schemas.openxmlformats.org/officeDocument/2006/relationships" xmlns:m="http://schemas.openxmlformats.org/officeDocument/2006/math" xmlns:v="urn:schemas-microsoft-com:vml" xmlns:wp14="http://schemas.microsoft.com/office/word/2010/wordprocessingDrawing" xmlns:wp="http://schemas.openxmlformats.org/drawingml/2006/wordprocessingDrawing" xmlns:w10="urn:schemas-microsoft-com:office:word" xmlns:w="http://schemas.openxmlformats.org/wordprocessingml/2006/main" xmlns:w14="http://schemas.microsoft.com/office/word/2010/wordml" xmlns:w15="http://schemas.microsoft.com/office/word/2012/wordml" xmlns:w16cex="http://schemas.microsoft.com/office/word/2018/wordml/cex" xmlns:w16cid="http://schemas.microsoft.com/office/word/2016/wordml/cid" xmlns:w16="http://schemas.microsoft.com/office/word/2018/wordml" xmlns:w16du="http://schemas.microsoft.com/office/word/2023/wordml/word16du" xmlns:w16sdtdh="http://schemas.microsoft.com/office/word/2020/wordml/sdtdatahash" xmlns:w16sdtfl="http://schemas.microsoft.com/office/word/2024/wordml/sdtformatlock" xmlns:w16se="http://schemas.microsoft.com/office/word/2015/wordml/symex" xmlns:wpg="http://schemas.microsoft.com/office/word/2010/wordprocessingGroup" xmlns:wpi="http://schemas.microsoft.com/office/word/2010/wordprocessingInk" xmlns:wne="http://schemas.microsoft.com/office/word/2006/wordml" xmlns:wps="http://schemas.microsoft.com/office/word/2010/wordprocessingShape" mc:Ignorable="w14 w15 w16se w16cid w16 w16cex w16sdtdh w16sdtfl w16du wp14">
   <w:footnote w:type="separator" w:id="-1">
     <w:p>
       <w:pPr>
@@ -1146,7 +1133,7 @@
 </file>
 
 <file path=word/numbering.xml><?xml version="1.0" encoding="utf-8"?>
-<w:numbering xmlns:wpc="http://schemas.microsoft.com/office/word/2010/wordprocessingCanvas" xmlns:cx="http://schemas.microsoft.com/office/drawing/2014/chartex" xmlns:cx1="http://schemas.microsoft.com/office/drawing/2015/9/8/chartex" xmlns:cx2="http://schemas.microsoft.com/office/drawing/2015/10/21/chartex" xmlns:cx3="http://schemas.microsoft.com/office/drawing/2016/5/9/chartex" xmlns:cx4="http://schemas.microsoft.com/office/drawing/2016/5/10/chartex" xmlns:cx5="http://schemas.microsoft.com/office/drawing/2016/5/11/chartex" xmlns:cx6="http://schemas.microsoft.com/office/drawing/2016/5/12/chartex" xmlns:cx7="http://schemas.microsoft.com/office/drawing/2016/5/13/chartex" xmlns:cx8="http://schemas.microsoft.com/office/drawing/2016/5/14/chartex" xmlns:mc="http://schemas.openxmlformats.org/markup-compatibility/2006" xmlns:aink="http://schemas.microsoft.com/office/drawing/2016/ink" xmlns:am3d="http://schemas.microsoft.com/office/drawing/2017/model3d" xmlns:o="urn:schemas-microsoft-com:office:office" xmlns:r="http://schemas.openxmlformats.org/officeDocument/2006/relationships" xmlns:m="http://schemas.openxmlformats.org/officeDocument/2006/math" xmlns:v="urn:schemas-microsoft-com:vml" xmlns:wp14="http://schemas.microsoft.com/office/word/2010/wordprocessingDrawing" xmlns:wp="http://schemas.openxmlformats.org/drawingml/2006/wordprocessingDrawing" xmlns:w10="urn:schemas-microsoft-com:office:word" xmlns:w="http://schemas.openxmlformats.org/wordprocessingml/2006/main" xmlns:w14="http://schemas.microsoft.com/office/word/2010/wordml" xmlns:w15="http://schemas.microsoft.com/office/word/2012/wordml" xmlns:w16cex="http://schemas.microsoft.com/office/word/2018/wordml/cex" xmlns:w16cid="http://schemas.microsoft.com/office/word/2016/wordml/cid" xmlns:w16="http://schemas.microsoft.com/office/word/2018/wordml" xmlns:w16sdtdh="http://schemas.microsoft.com/office/word/2020/wordml/sdtdatahash" xmlns:w16se="http://schemas.microsoft.com/office/word/2015/wordml/symex" xmlns:wpg="http://schemas.microsoft.com/office/word/2010/wordprocessingGroup" xmlns:wpi="http://schemas.microsoft.com/office/word/2010/wordprocessingInk" xmlns:wne="http://schemas.microsoft.com/office/word/2006/wordml" xmlns:wps="http://schemas.microsoft.com/office/word/2010/wordprocessingShape" mc:Ignorable="w14 w15 w16se w16cid w16 w16cex w16sdtdh wp14">
+<w:numbering xmlns:wpc="http://schemas.microsoft.com/office/word/2010/wordprocessingCanvas" xmlns:cx="http://schemas.microsoft.com/office/drawing/2014/chartex" xmlns:cx1="http://schemas.microsoft.com/office/drawing/2015/9/8/chartex" xmlns:cx2="http://schemas.microsoft.com/office/drawing/2015/10/21/chartex" xmlns:cx3="http://schemas.microsoft.com/office/drawing/2016/5/9/chartex" xmlns:cx4="http://schemas.microsoft.com/office/drawing/2016/5/10/chartex" xmlns:cx5="http://schemas.microsoft.com/office/drawing/2016/5/11/chartex" xmlns:cx6="http://schemas.microsoft.com/office/drawing/2016/5/12/chartex" xmlns:cx7="http://schemas.microsoft.com/office/drawing/2016/5/13/chartex" xmlns:cx8="http://schemas.microsoft.com/office/drawing/2016/5/14/chartex" xmlns:mc="http://schemas.openxmlformats.org/markup-compatibility/2006" xmlns:aink="http://schemas.microsoft.com/office/drawing/2016/ink" xmlns:am3d="http://schemas.microsoft.com/office/drawing/2017/model3d" xmlns:o="urn:schemas-microsoft-com:office:office" xmlns:oel="http://schemas.microsoft.com/office/2019/extlst" xmlns:r="http://schemas.openxmlformats.org/officeDocument/2006/relationships" xmlns:m="http://schemas.openxmlformats.org/officeDocument/2006/math" xmlns:v="urn:schemas-microsoft-com:vml" xmlns:wp14="http://schemas.microsoft.com/office/word/2010/wordprocessingDrawing" xmlns:wp="http://schemas.openxmlformats.org/drawingml/2006/wordprocessingDrawing" xmlns:w10="urn:schemas-microsoft-com:office:word" xmlns:w="http://schemas.openxmlformats.org/wordprocessingml/2006/main" xmlns:w14="http://schemas.microsoft.com/office/word/2010/wordml" xmlns:w15="http://schemas.microsoft.com/office/word/2012/wordml" xmlns:w16cex="http://schemas.microsoft.com/office/word/2018/wordml/cex" xmlns:w16cid="http://schemas.microsoft.com/office/word/2016/wordml/cid" xmlns:w16="http://schemas.microsoft.com/office/word/2018/wordml" xmlns:w16du="http://schemas.microsoft.com/office/word/2023/wordml/word16du" xmlns:w16sdtdh="http://schemas.microsoft.com/office/word/2020/wordml/sdtdatahash" xmlns:w16sdtfl="http://schemas.microsoft.com/office/word/2024/wordml/sdtformatlock" xmlns:w16se="http://schemas.microsoft.com/office/word/2015/wordml/symex" xmlns:wpg="http://schemas.microsoft.com/office/word/2010/wordprocessingGroup" xmlns:wpi="http://schemas.microsoft.com/office/word/2010/wordprocessingInk" xmlns:wne="http://schemas.microsoft.com/office/word/2006/wordml" xmlns:wps="http://schemas.microsoft.com/office/word/2010/wordprocessingShape" mc:Ignorable="w14 w15 w16se w16cid w16 w16cex w16sdtdh w16sdtfl w16du wp14">
   <w:abstractNum w:abstractNumId="0" w15:restartNumberingAfterBreak="0">
     <w:nsid w:val="07EF9ED1"/>
     <w:multiLevelType w:val="hybridMultilevel"/>
@@ -1914,37 +1901,37 @@
       </w:pPr>
     </w:lvl>
   </w:abstractNum>
-  <w:num w:numId="1">
+  <w:num w:numId="1" w16cid:durableId="87241835">
     <w:abstractNumId w:val="4"/>
   </w:num>
-  <w:num w:numId="2">
+  <w:num w:numId="2" w16cid:durableId="1079408265">
     <w:abstractNumId w:val="6"/>
   </w:num>
-  <w:num w:numId="3">
+  <w:num w:numId="3" w16cid:durableId="715159448">
     <w:abstractNumId w:val="2"/>
   </w:num>
-  <w:num w:numId="4">
+  <w:num w:numId="4" w16cid:durableId="1194686437">
     <w:abstractNumId w:val="0"/>
   </w:num>
-  <w:num w:numId="5">
+  <w:num w:numId="5" w16cid:durableId="341397658">
     <w:abstractNumId w:val="4"/>
   </w:num>
-  <w:num w:numId="6">
+  <w:num w:numId="6" w16cid:durableId="819997906">
     <w:abstractNumId w:val="4"/>
   </w:num>
-  <w:num w:numId="7">
+  <w:num w:numId="7" w16cid:durableId="468937193">
     <w:abstractNumId w:val="5"/>
   </w:num>
-  <w:num w:numId="8">
+  <w:num w:numId="8" w16cid:durableId="151067002">
     <w:abstractNumId w:val="3"/>
   </w:num>
-  <w:num w:numId="9">
+  <w:num w:numId="9" w16cid:durableId="772818463">
     <w:abstractNumId w:val="1"/>
   </w:num>
-  <w:num w:numId="10">
+  <w:num w:numId="10" w16cid:durableId="1672220704">
     <w:abstractNumId w:val="4"/>
   </w:num>
-  <w:num w:numId="11">
+  <w:num w:numId="11" w16cid:durableId="424158087">
     <w:abstractNumId w:val="4"/>
   </w:num>
   <w:numIdMacAtCleanup w:val="3"/>
@@ -1952,7 +1939,7 @@
 </file>
 
 <file path=word/styles.xml><?xml version="1.0" encoding="utf-8"?>
-<w:styles xmlns:mc="http://schemas.openxmlformats.org/markup-compatibility/2006" xmlns:r="http://schemas.openxmlformats.org/officeDocument/2006/relationships" xmlns:w="http://schemas.openxmlformats.org/wordprocessingml/2006/main" xmlns:w14="http://schemas.microsoft.com/office/word/2010/wordml" xmlns:w15="http://schemas.microsoft.com/office/word/2012/wordml" xmlns:w16cex="http://schemas.microsoft.com/office/word/2018/wordml/cex" xmlns:w16cid="http://schemas.microsoft.com/office/word/2016/wordml/cid" xmlns:w16="http://schemas.microsoft.com/office/word/2018/wordml" xmlns:w16sdtdh="http://schemas.microsoft.com/office/word/2020/wordml/sdtdatahash" xmlns:w16se="http://schemas.microsoft.com/office/word/2015/wordml/symex" mc:Ignorable="w14 w15 w16se w16cid w16 w16cex w16sdtdh">
+<w:styles xmlns:mc="http://schemas.openxmlformats.org/markup-compatibility/2006" xmlns:r="http://schemas.openxmlformats.org/officeDocument/2006/relationships" xmlns:w="http://schemas.openxmlformats.org/wordprocessingml/2006/main" xmlns:w14="http://schemas.microsoft.com/office/word/2010/wordml" xmlns:w15="http://schemas.microsoft.com/office/word/2012/wordml" xmlns:w16cex="http://schemas.microsoft.com/office/word/2018/wordml/cex" xmlns:w16cid="http://schemas.microsoft.com/office/word/2016/wordml/cid" xmlns:w16="http://schemas.microsoft.com/office/word/2018/wordml" xmlns:w16du="http://schemas.microsoft.com/office/word/2023/wordml/word16du" xmlns:w16sdtdh="http://schemas.microsoft.com/office/word/2020/wordml/sdtdatahash" xmlns:w16sdtfl="http://schemas.microsoft.com/office/word/2024/wordml/sdtformatlock" xmlns:w16se="http://schemas.microsoft.com/office/word/2015/wordml/symex" mc:Ignorable="w14 w15 w16se w16cid w16 w16cex w16sdtdh w16sdtfl w16du">
   <w:docDefaults>
     <w:rPrDefault>
       <w:rPr>
@@ -2594,6 +2581,7 @@
   <w:style w:type="character" w:default="1" w:styleId="Fuentedeprrafopredeter">
     <w:name w:val="Default Paragraph Font"/>
     <w:uiPriority w:val="1"/>
+    <w:semiHidden/>
     <w:unhideWhenUsed/>
   </w:style>
   <w:style w:type="table" w:default="1" w:styleId="Tablanormal">
@@ -3525,7 +3513,7 @@
 </file>
 
 <file path=word/glossary/document.xml><?xml version="1.0" encoding="utf-8"?>
-<w:glossaryDocument xmlns:wpc="http://schemas.microsoft.com/office/word/2010/wordprocessingCanvas" xmlns:cx="http://schemas.microsoft.com/office/drawing/2014/chartex" xmlns:cx1="http://schemas.microsoft.com/office/drawing/2015/9/8/chartex" xmlns:cx2="http://schemas.microsoft.com/office/drawing/2015/10/21/chartex" xmlns:cx3="http://schemas.microsoft.com/office/drawing/2016/5/9/chartex" xmlns:cx4="http://schemas.microsoft.com/office/drawing/2016/5/10/chartex" xmlns:cx5="http://schemas.microsoft.com/office/drawing/2016/5/11/chartex" xmlns:cx6="http://schemas.microsoft.com/office/drawing/2016/5/12/chartex" xmlns:cx7="http://schemas.microsoft.com/office/drawing/2016/5/13/chartex" xmlns:cx8="http://schemas.microsoft.com/office/drawing/2016/5/14/chartex" xmlns:mc="http://schemas.openxmlformats.org/markup-compatibility/2006" xmlns:aink="http://schemas.microsoft.com/office/drawing/2016/ink" xmlns:am3d="http://schemas.microsoft.com/office/drawing/2017/model3d" xmlns:o="urn:schemas-microsoft-com:office:office" xmlns:r="http://schemas.openxmlformats.org/officeDocument/2006/relationships" xmlns:m="http://schemas.openxmlformats.org/officeDocument/2006/math" xmlns:v="urn:schemas-microsoft-com:vml" xmlns:wp14="http://schemas.microsoft.com/office/word/2010/wordprocessingDrawing" xmlns:wp="http://schemas.openxmlformats.org/drawingml/2006/wordprocessingDrawing" xmlns:w10="urn:schemas-microsoft-com:office:word" xmlns:w="http://schemas.openxmlformats.org/wordprocessingml/2006/main" xmlns:w14="http://schemas.microsoft.com/office/word/2010/wordml" xmlns:w15="http://schemas.microsoft.com/office/word/2012/wordml" xmlns:w16cex="http://schemas.microsoft.com/office/word/2018/wordml/cex" xmlns:w16cid="http://schemas.microsoft.com/office/word/2016/wordml/cid" xmlns:w16="http://schemas.microsoft.com/office/word/2018/wordml" xmlns:w16sdtdh="http://schemas.microsoft.com/office/word/2020/wordml/sdtdatahash" xmlns:w16se="http://schemas.microsoft.com/office/word/2015/wordml/symex" xmlns:wpg="http://schemas.microsoft.com/office/word/2010/wordprocessingGroup" xmlns:wpi="http://schemas.microsoft.com/office/word/2010/wordprocessingInk" xmlns:wne="http://schemas.microsoft.com/office/word/2006/wordml" xmlns:wps="http://schemas.microsoft.com/office/word/2010/wordprocessingShape" mc:Ignorable="w14 w15 w16se w16cid w16 w16cex w16sdtdh wp14">
+<w:glossaryDocument xmlns:wpc="http://schemas.microsoft.com/office/word/2010/wordprocessingCanvas" xmlns:cx="http://schemas.microsoft.com/office/drawing/2014/chartex" xmlns:cx1="http://schemas.microsoft.com/office/drawing/2015/9/8/chartex" xmlns:cx2="http://schemas.microsoft.com/office/drawing/2015/10/21/chartex" xmlns:cx3="http://schemas.microsoft.com/office/drawing/2016/5/9/chartex" xmlns:cx4="http://schemas.microsoft.com/office/drawing/2016/5/10/chartex" xmlns:cx5="http://schemas.microsoft.com/office/drawing/2016/5/11/chartex" xmlns:cx6="http://schemas.microsoft.com/office/drawing/2016/5/12/chartex" xmlns:cx7="http://schemas.microsoft.com/office/drawing/2016/5/13/chartex" xmlns:cx8="http://schemas.microsoft.com/office/drawing/2016/5/14/chartex" xmlns:mc="http://schemas.openxmlformats.org/markup-compatibility/2006" xmlns:aink="http://schemas.microsoft.com/office/drawing/2016/ink" xmlns:am3d="http://schemas.microsoft.com/office/drawing/2017/model3d" xmlns:o="urn:schemas-microsoft-com:office:office" xmlns:oel="http://schemas.microsoft.com/office/2019/extlst" xmlns:r="http://schemas.openxmlformats.org/officeDocument/2006/relationships" xmlns:m="http://schemas.openxmlformats.org/officeDocument/2006/math" xmlns:v="urn:schemas-microsoft-com:vml" xmlns:wp14="http://schemas.microsoft.com/office/word/2010/wordprocessingDrawing" xmlns:wp="http://schemas.openxmlformats.org/drawingml/2006/wordprocessingDrawing" xmlns:w10="urn:schemas-microsoft-com:office:word" xmlns:w="http://schemas.openxmlformats.org/wordprocessingml/2006/main" xmlns:w14="http://schemas.microsoft.com/office/word/2010/wordml" xmlns:w15="http://schemas.microsoft.com/office/word/2012/wordml" xmlns:w16cex="http://schemas.microsoft.com/office/word/2018/wordml/cex" xmlns:w16cid="http://schemas.microsoft.com/office/word/2016/wordml/cid" xmlns:w16="http://schemas.microsoft.com/office/word/2018/wordml" xmlns:w16du="http://schemas.microsoft.com/office/word/2023/wordml/word16du" xmlns:w16sdtdh="http://schemas.microsoft.com/office/word/2020/wordml/sdtdatahash" xmlns:w16sdtfl="http://schemas.microsoft.com/office/word/2024/wordml/sdtformatlock" xmlns:w16se="http://schemas.microsoft.com/office/word/2015/wordml/symex" xmlns:wpg="http://schemas.microsoft.com/office/word/2010/wordprocessingGroup" xmlns:wpi="http://schemas.microsoft.com/office/word/2010/wordprocessingInk" xmlns:wne="http://schemas.microsoft.com/office/word/2006/wordml" xmlns:wps="http://schemas.microsoft.com/office/word/2010/wordprocessingShape" mc:Ignorable="w14 w15 w16se w16cid w16 w16cex w16sdtdh w16sdtfl w16du wp14">
   <w:docParts>
     <w:docPart>
       <w:docPartPr>
@@ -3559,11 +3547,11 @@
 </file>
 
 <file path=word/glossary/fontTable.xml><?xml version="1.0" encoding="utf-8"?>
-<w:fonts xmlns:mc="http://schemas.openxmlformats.org/markup-compatibility/2006" xmlns:r="http://schemas.openxmlformats.org/officeDocument/2006/relationships" xmlns:w="http://schemas.openxmlformats.org/wordprocessingml/2006/main" xmlns:w14="http://schemas.microsoft.com/office/word/2010/wordml" xmlns:w15="http://schemas.microsoft.com/office/word/2012/wordml" xmlns:w16cex="http://schemas.microsoft.com/office/word/2018/wordml/cex" xmlns:w16cid="http://schemas.microsoft.com/office/word/2016/wordml/cid" xmlns:w16="http://schemas.microsoft.com/office/word/2018/wordml" xmlns:w16sdtdh="http://schemas.microsoft.com/office/word/2020/wordml/sdtdatahash" xmlns:w16se="http://schemas.microsoft.com/office/word/2015/wordml/symex" mc:Ignorable="w14 w15 w16se w16cid w16 w16cex w16sdtdh">
+<w:fonts xmlns:mc="http://schemas.openxmlformats.org/markup-compatibility/2006" xmlns:r="http://schemas.openxmlformats.org/officeDocument/2006/relationships" xmlns:w="http://schemas.openxmlformats.org/wordprocessingml/2006/main" xmlns:w14="http://schemas.microsoft.com/office/word/2010/wordml" xmlns:w15="http://schemas.microsoft.com/office/word/2012/wordml" xmlns:w16cex="http://schemas.microsoft.com/office/word/2018/wordml/cex" xmlns:w16cid="http://schemas.microsoft.com/office/word/2016/wordml/cid" xmlns:w16="http://schemas.microsoft.com/office/word/2018/wordml" xmlns:w16du="http://schemas.microsoft.com/office/word/2023/wordml/word16du" xmlns:w16sdtdh="http://schemas.microsoft.com/office/word/2020/wordml/sdtdatahash" xmlns:w16sdtfl="http://schemas.microsoft.com/office/word/2024/wordml/sdtformatlock" xmlns:w16se="http://schemas.microsoft.com/office/word/2015/wordml/symex" mc:Ignorable="w14 w15 w16se w16cid w16 w16cex w16sdtdh w16sdtfl w16du">
   <w:font w:name="Symbol">
     <w:panose1 w:val="05050102010706020507"/>
     <w:charset w:val="02"/>
-    <w:family w:val="roman"/>
+    <w:family w:val="decorative"/>
     <w:pitch w:val="variable"/>
     <w:sig w:usb0="00000000" w:usb1="10000000" w:usb2="00000000" w:usb3="00000000" w:csb0="80000000" w:csb1="00000000"/>
   </w:font>
@@ -3593,7 +3581,7 @@
     <w:charset w:val="00"/>
     <w:family w:val="swiss"/>
     <w:pitch w:val="variable"/>
-    <w:sig w:usb0="E4002EFF" w:usb1="C200247B" w:usb2="00000009" w:usb3="00000000" w:csb0="000001FF" w:csb1="00000000"/>
+    <w:sig w:usb0="E0002AFF" w:usb1="C000247B" w:usb2="00000009" w:usb3="00000000" w:csb0="000001FF" w:csb1="00000000"/>
   </w:font>
   <w:font w:name="Arial">
     <w:panose1 w:val="020B0604020202020204"/>
@@ -3622,19 +3610,34 @@
     <w:charset w:val="00"/>
     <w:family w:val="swiss"/>
     <w:pitch w:val="variable"/>
-    <w:sig w:usb0="E4002EFF" w:usb1="C200247B" w:usb2="00000009" w:usb3="00000000" w:csb0="000001FF" w:csb1="00000000"/>
+    <w:sig w:usb0="E0002AFF" w:usb1="C000247B" w:usb2="00000009" w:usb3="00000000" w:csb0="000001FF" w:csb1="00000000"/>
   </w:font>
   <w:font w:name="Yu Mincho">
+    <w:panose1 w:val="02020400000000000000"/>
     <w:charset w:val="80"/>
     <w:family w:val="roman"/>
     <w:pitch w:val="variable"/>
     <w:sig w:usb0="800002E7" w:usb1="2AC7FCFF" w:usb2="00000012" w:usb3="00000000" w:csb0="0002009F" w:csb1="00000000"/>
   </w:font>
+  <w:font w:name="Aptos">
+    <w:panose1 w:val="020B0004020202020204"/>
+    <w:charset w:val="00"/>
+    <w:family w:val="swiss"/>
+    <w:pitch w:val="variable"/>
+    <w:sig w:usb0="20000287" w:usb1="00000003" w:usb2="00000000" w:usb3="00000000" w:csb0="0000019F" w:csb1="00000000"/>
+  </w:font>
+  <w:font w:name="Aptos Display">
+    <w:panose1 w:val="020B0004020202020204"/>
+    <w:charset w:val="00"/>
+    <w:family w:val="swiss"/>
+    <w:pitch w:val="variable"/>
+    <w:sig w:usb0="20000287" w:usb1="00000003" w:usb2="00000000" w:usb3="00000000" w:csb0="0000019F" w:csb1="00000000"/>
+  </w:font>
 </w:fonts>
 </file>
 
 <file path=word/glossary/settings.xml><?xml version="1.0" encoding="utf-8"?>
-<w:settings xmlns:mc="http://schemas.openxmlformats.org/markup-compatibility/2006" xmlns:o="urn:schemas-microsoft-com:office:office" xmlns:r="http://schemas.openxmlformats.org/officeDocument/2006/relationships" xmlns:m="http://schemas.openxmlformats.org/officeDocument/2006/math" xmlns:v="urn:schemas-microsoft-com:vml" xmlns:w10="urn:schemas-microsoft-com:office:word" xmlns:w="http://schemas.openxmlformats.org/wordprocessingml/2006/main" xmlns:w14="http://schemas.microsoft.com/office/word/2010/wordml" xmlns:w15="http://schemas.microsoft.com/office/word/2012/wordml" xmlns:w16cex="http://schemas.microsoft.com/office/word/2018/wordml/cex" xmlns:w16cid="http://schemas.microsoft.com/office/word/2016/wordml/cid" xmlns:w16="http://schemas.microsoft.com/office/word/2018/wordml" xmlns:w16sdtdh="http://schemas.microsoft.com/office/word/2020/wordml/sdtdatahash" xmlns:w16se="http://schemas.microsoft.com/office/word/2015/wordml/symex" xmlns:sl="http://schemas.openxmlformats.org/schemaLibrary/2006/main" mc:Ignorable="w14 w15 w16se w16cid w16 w16cex w16sdtdh">
+<w:settings xmlns:mc="http://schemas.openxmlformats.org/markup-compatibility/2006" xmlns:o="urn:schemas-microsoft-com:office:office" xmlns:r="http://schemas.openxmlformats.org/officeDocument/2006/relationships" xmlns:m="http://schemas.openxmlformats.org/officeDocument/2006/math" xmlns:v="urn:schemas-microsoft-com:vml" xmlns:w10="urn:schemas-microsoft-com:office:word" xmlns:w="http://schemas.openxmlformats.org/wordprocessingml/2006/main" xmlns:w14="http://schemas.microsoft.com/office/word/2010/wordml" xmlns:w15="http://schemas.microsoft.com/office/word/2012/wordml" xmlns:w16cex="http://schemas.microsoft.com/office/word/2018/wordml/cex" xmlns:w16cid="http://schemas.microsoft.com/office/word/2016/wordml/cid" xmlns:w16="http://schemas.microsoft.com/office/word/2018/wordml" xmlns:w16du="http://schemas.microsoft.com/office/word/2023/wordml/word16du" xmlns:w16sdtdh="http://schemas.microsoft.com/office/word/2020/wordml/sdtdatahash" xmlns:w16sdtfl="http://schemas.microsoft.com/office/word/2024/wordml/sdtformatlock" xmlns:w16se="http://schemas.microsoft.com/office/word/2015/wordml/symex" xmlns:sl="http://schemas.openxmlformats.org/schemaLibrary/2006/main" mc:Ignorable="w14 w15 w16se w16cid w16 w16cex w16sdtdh w16sdtfl w16du">
   <w:view w:val="normal"/>
   <w:defaultTabStop w:val="708"/>
   <w:hyphenationZone w:val="425"/>
@@ -3674,8 +3677,10 @@
     <w:rsid w:val="004E74F6"/>
     <w:rsid w:val="004F23EA"/>
     <w:rsid w:val="005A5BEE"/>
+    <w:rsid w:val="006B002E"/>
     <w:rsid w:val="006D0020"/>
     <w:rsid w:val="006D29C6"/>
+    <w:rsid w:val="006E6C32"/>
     <w:rsid w:val="00700D70"/>
     <w:rsid w:val="0077239B"/>
     <w:rsid w:val="007F3532"/>
@@ -3719,14 +3724,14 @@
   </m:mathPr>
   <w:themeFontLang w:val="es-EC"/>
   <w:clrSchemeMapping w:bg1="light1" w:t1="dark1" w:bg2="light2" w:t2="dark2" w:accent1="accent1" w:accent2="accent2" w:accent3="accent3" w:accent4="accent4" w:accent5="accent5" w:accent6="accent6" w:hyperlink="hyperlink" w:followedHyperlink="followedHyperlink"/>
-  <w:decimalSymbol w:val="."/>
+  <w:decimalSymbol w:val=","/>
   <w:listSeparator w:val=";"/>
   <w15:chartTrackingRefBased/>
 </w:settings>
 </file>
 
 <file path=word/glossary/styles.xml><?xml version="1.0" encoding="utf-8"?>
-<w:styles xmlns:mc="http://schemas.openxmlformats.org/markup-compatibility/2006" xmlns:r="http://schemas.openxmlformats.org/officeDocument/2006/relationships" xmlns:w="http://schemas.openxmlformats.org/wordprocessingml/2006/main" xmlns:w14="http://schemas.microsoft.com/office/word/2010/wordml" xmlns:w15="http://schemas.microsoft.com/office/word/2012/wordml" xmlns:w16cex="http://schemas.microsoft.com/office/word/2018/wordml/cex" xmlns:w16cid="http://schemas.microsoft.com/office/word/2016/wordml/cid" xmlns:w16="http://schemas.microsoft.com/office/word/2018/wordml" xmlns:w16sdtdh="http://schemas.microsoft.com/office/word/2020/wordml/sdtdatahash" xmlns:w16se="http://schemas.microsoft.com/office/word/2015/wordml/symex" mc:Ignorable="w14 w15 w16se w16cid w16 w16cex w16sdtdh">
+<w:styles xmlns:mc="http://schemas.openxmlformats.org/markup-compatibility/2006" xmlns:r="http://schemas.openxmlformats.org/officeDocument/2006/relationships" xmlns:w="http://schemas.openxmlformats.org/wordprocessingml/2006/main" xmlns:w14="http://schemas.microsoft.com/office/word/2010/wordml" xmlns:w15="http://schemas.microsoft.com/office/word/2012/wordml" xmlns:w16cex="http://schemas.microsoft.com/office/word/2018/wordml/cex" xmlns:w16cid="http://schemas.microsoft.com/office/word/2016/wordml/cid" xmlns:w16="http://schemas.microsoft.com/office/word/2018/wordml" xmlns:w16du="http://schemas.microsoft.com/office/word/2023/wordml/word16du" xmlns:w16sdtdh="http://schemas.microsoft.com/office/word/2020/wordml/sdtdatahash" xmlns:w16sdtfl="http://schemas.microsoft.com/office/word/2024/wordml/sdtformatlock" xmlns:w16se="http://schemas.microsoft.com/office/word/2015/wordml/symex" mc:Ignorable="w14 w15 w16se w16cid w16 w16cex w16sdtdh w16sdtfl w16du">
   <w:docDefaults>
     <w:rPrDefault>
       <w:rPr>
@@ -4163,65 +4168,11 @@
       <w:color w:val="666666"/>
     </w:rPr>
   </w:style>
-  <w:style w:type="paragraph" w:customStyle="1" w:styleId="D08C73F1A08528468C279FD4254F72C4">
-    <w:name w:val="D08C73F1A08528468C279FD4254F72C4"/>
-    <w:rsid w:val="002F4909"/>
-  </w:style>
-  <w:style w:type="paragraph" w:customStyle="1" w:styleId="7D1A664E5C2F7B44A820ACFA70B44BB5">
-    <w:name w:val="7D1A664E5C2F7B44A820ACFA70B44BB5"/>
-    <w:rsid w:val="00DF55B8"/>
-  </w:style>
-  <w:style w:type="paragraph" w:customStyle="1" w:styleId="68D81DFFF1D345D0A0193F64226A02DC">
-    <w:name w:val="68D81DFFF1D345D0A0193F64226A02DC"/>
-    <w:rsid w:val="007F3532"/>
-    <w:pPr>
-      <w:spacing w:line="259" w:lineRule="auto"/>
-    </w:pPr>
-    <w:rPr>
-      <w:kern w:val="0"/>
-      <w:sz w:val="22"/>
-      <w:szCs w:val="22"/>
-      <w:lang w:val="es-PE" w:eastAsia="es-PE"/>
-      <w14:ligatures w14:val="none"/>
-    </w:rPr>
-  </w:style>
-  <w:style w:type="paragraph" w:customStyle="1" w:styleId="E9E7F7C92955490DB7657F94DD29336C">
-    <w:name w:val="E9E7F7C92955490DB7657F94DD29336C"/>
-    <w:rsid w:val="007F3532"/>
-    <w:pPr>
-      <w:spacing w:line="259" w:lineRule="auto"/>
-    </w:pPr>
-    <w:rPr>
-      <w:kern w:val="0"/>
-      <w:sz w:val="22"/>
-      <w:szCs w:val="22"/>
-      <w:lang w:val="es-PE" w:eastAsia="es-PE"/>
-      <w14:ligatures w14:val="none"/>
-    </w:rPr>
-  </w:style>
-  <w:style w:type="paragraph" w:customStyle="1" w:styleId="800B21000C8443E1A619727CC725D260">
-    <w:name w:val="800B21000C8443E1A619727CC725D260"/>
-    <w:rsid w:val="007F3532"/>
-    <w:pPr>
-      <w:spacing w:line="259" w:lineRule="auto"/>
-    </w:pPr>
-    <w:rPr>
-      <w:kern w:val="0"/>
-      <w:sz w:val="22"/>
-      <w:szCs w:val="22"/>
-      <w:lang w:val="es-PE" w:eastAsia="es-PE"/>
-      <w14:ligatures w14:val="none"/>
-    </w:rPr>
-  </w:style>
-  <w:style w:type="paragraph" w:customStyle="1" w:styleId="F3B23AE87486E744A6B8FE577F4973A0">
-    <w:name w:val="F3B23AE87486E744A6B8FE577F4973A0"/>
-    <w:rsid w:val="001F051B"/>
-  </w:style>
 </w:styles>
 </file>
 
 <file path=word/glossary/webSettings.xml><?xml version="1.0" encoding="utf-8"?>
-<w:webSettings xmlns:mc="http://schemas.openxmlformats.org/markup-compatibility/2006" xmlns:r="http://schemas.openxmlformats.org/officeDocument/2006/relationships" xmlns:w="http://schemas.openxmlformats.org/wordprocessingml/2006/main" xmlns:w14="http://schemas.microsoft.com/office/word/2010/wordml" xmlns:w15="http://schemas.microsoft.com/office/word/2012/wordml" xmlns:w16cex="http://schemas.microsoft.com/office/word/2018/wordml/cex" xmlns:w16cid="http://schemas.microsoft.com/office/word/2016/wordml/cid" xmlns:w16="http://schemas.microsoft.com/office/word/2018/wordml" xmlns:w16sdtdh="http://schemas.microsoft.com/office/word/2020/wordml/sdtdatahash" xmlns:w16se="http://schemas.microsoft.com/office/word/2015/wordml/symex" mc:Ignorable="w14 w15 w16se w16cid w16 w16cex w16sdtdh">
+<w:webSettings xmlns:mc="http://schemas.openxmlformats.org/markup-compatibility/2006" xmlns:r="http://schemas.openxmlformats.org/officeDocument/2006/relationships" xmlns:w="http://schemas.openxmlformats.org/wordprocessingml/2006/main" xmlns:w14="http://schemas.microsoft.com/office/word/2010/wordml" xmlns:w15="http://schemas.microsoft.com/office/word/2012/wordml" xmlns:w16cex="http://schemas.microsoft.com/office/word/2018/wordml/cex" xmlns:w16cid="http://schemas.microsoft.com/office/word/2016/wordml/cid" xmlns:w16="http://schemas.microsoft.com/office/word/2018/wordml" xmlns:w16du="http://schemas.microsoft.com/office/word/2023/wordml/word16du" xmlns:w16sdtdh="http://schemas.microsoft.com/office/word/2020/wordml/sdtdatahash" xmlns:w16sdtfl="http://schemas.microsoft.com/office/word/2024/wordml/sdtformatlock" xmlns:w16se="http://schemas.microsoft.com/office/word/2015/wordml/symex" mc:Ignorable="w14 w15 w16se w16cid w16 w16cex w16sdtdh w16sdtfl w16du">
   <w:optimizeForBrowser/>
   <w:allowPNG/>
 </w:webSettings>
@@ -4606,24 +4557,10 @@
 </file>
 
 <file path=customXml/item1.xml><?xml version="1.0" encoding="utf-8"?>
-<?mso-contentType ?>
-<FormTemplates xmlns="http://schemas.microsoft.com/sharepoint/v3/contenttype/forms">
-  <Display>DocumentLibraryForm</Display>
-  <Edit>DocumentLibraryForm</Edit>
-  <New>DocumentLibraryForm</New>
-</FormTemplates>
+<b:Sources xmlns:b="http://schemas.openxmlformats.org/officeDocument/2006/bibliography" xmlns="http://schemas.openxmlformats.org/officeDocument/2006/bibliography" SelectedStyle="/APASixthEditionOfficeOnline.xsl" StyleName="APA" Version="6"/>
 </file>
 
 <file path=customXml/item2.xml><?xml version="1.0" encoding="utf-8"?>
-<p:properties xmlns:p="http://schemas.microsoft.com/office/2006/metadata/properties" xmlns:xsi="http://www.w3.org/2001/XMLSchema-instance" xmlns:pc="http://schemas.microsoft.com/office/infopath/2007/PartnerControls">
-  <documentManagement>
-    <Nro xmlns="e62bc30b-b884-4ee1-b0ab-e2e35dfacfd5">0</Nro>
-    <Unidad xmlns="e62bc30b-b884-4ee1-b0ab-e2e35dfacfd5" xsi:nil="true"/>
-  </documentManagement>
-</p:properties>
-</file>
-
-<file path=customXml/item3.xml><?xml version="1.0" encoding="utf-8"?>
 <ct:contentTypeSchema xmlns:ct="http://schemas.microsoft.com/office/2006/metadata/contentType" xmlns:ma="http://schemas.microsoft.com/office/2006/metadata/properties/metaAttributes" ct:_="" ma:_="" ma:contentTypeName="Documento" ma:contentTypeID="0x01010006ACA7DB3593B24E887290A71F51A18F" ma:contentTypeVersion="10" ma:contentTypeDescription="Crear nuevo documento." ma:contentTypeScope="" ma:versionID="5fde8b866a40f115df17144418c3774a">
   <xsd:schema xmlns:xsd="http://www.w3.org/2001/XMLSchema" xmlns:xs="http://www.w3.org/2001/XMLSchema" xmlns:p="http://schemas.microsoft.com/office/2006/metadata/properties" xmlns:ns2="e62bc30b-b884-4ee1-b0ab-e2e35dfacfd5" targetNamespace="http://schemas.microsoft.com/office/2006/metadata/properties" ma:root="true" ma:fieldsID="722d0d74b5f1a0e9a135ab2398c17b72" ns2:_="">
     <xsd:import namespace="e62bc30b-b884-4ee1-b0ab-e2e35dfacfd5"/>
@@ -4803,29 +4740,33 @@
 </ct:contentTypeSchema>
 </file>
 
+<file path=customXml/item3.xml><?xml version="1.0" encoding="utf-8"?>
+<p:properties xmlns:p="http://schemas.microsoft.com/office/2006/metadata/properties" xmlns:xsi="http://www.w3.org/2001/XMLSchema-instance" xmlns:pc="http://schemas.microsoft.com/office/infopath/2007/PartnerControls">
+  <documentManagement>
+    <Nro xmlns="e62bc30b-b884-4ee1-b0ab-e2e35dfacfd5">0</Nro>
+    <Unidad xmlns="e62bc30b-b884-4ee1-b0ab-e2e35dfacfd5" xsi:nil="true"/>
+  </documentManagement>
+</p:properties>
+</file>
+
 <file path=customXml/item4.xml><?xml version="1.0" encoding="utf-8"?>
-<b:Sources xmlns:b="http://schemas.openxmlformats.org/officeDocument/2006/bibliography" xmlns="http://schemas.openxmlformats.org/officeDocument/2006/bibliography" SelectedStyle="/APASixthEditionOfficeOnline.xsl" StyleName="APA" Version="6"/>
+<?mso-contentType ?>
+<FormTemplates xmlns="http://schemas.microsoft.com/sharepoint/v3/contenttype/forms">
+  <Display>DocumentLibraryForm</Display>
+  <Edit>DocumentLibraryForm</Edit>
+  <New>DocumentLibraryForm</New>
+</FormTemplates>
 </file>
 
 <file path=customXml/itemProps1.xml><?xml version="1.0" encoding="utf-8"?>
-<ds:datastoreItem xmlns:ds="http://schemas.openxmlformats.org/officeDocument/2006/customXml" ds:itemID="{7E3075BF-FDAF-4D4D-8DC1-23126609A178}">
+<ds:datastoreItem xmlns:ds="http://schemas.openxmlformats.org/officeDocument/2006/customXml" ds:itemID="{BE0E3CBB-9640-C643-97A5-411B9F838128}">
   <ds:schemaRefs>
-    <ds:schemaRef ds:uri="http://schemas.microsoft.com/sharepoint/v3/contenttype/forms"/>
+    <ds:schemaRef ds:uri="http://schemas.openxmlformats.org/officeDocument/2006/bibliography"/>
   </ds:schemaRefs>
 </ds:datastoreItem>
 </file>
 
 <file path=customXml/itemProps2.xml><?xml version="1.0" encoding="utf-8"?>
-<ds:datastoreItem xmlns:ds="http://schemas.openxmlformats.org/officeDocument/2006/customXml" ds:itemID="{DAAF528F-7240-408A-9BF0-E37AC9702D32}">
-  <ds:schemaRefs>
-    <ds:schemaRef ds:uri="http://schemas.microsoft.com/office/2006/metadata/properties"/>
-    <ds:schemaRef ds:uri="http://schemas.microsoft.com/office/infopath/2007/PartnerControls"/>
-    <ds:schemaRef ds:uri="e62bc30b-b884-4ee1-b0ab-e2e35dfacfd5"/>
-  </ds:schemaRefs>
-</ds:datastoreItem>
-</file>
-
-<file path=customXml/itemProps3.xml><?xml version="1.0" encoding="utf-8"?>
 <ds:datastoreItem xmlns:ds="http://schemas.openxmlformats.org/officeDocument/2006/customXml" ds:itemID="{BB19413B-A659-4239-B251-6BE967D5DACB}">
   <ds:schemaRefs>
     <ds:schemaRef ds:uri="http://schemas.microsoft.com/office/2006/metadata/contentType"/>
@@ -4843,10 +4784,20 @@
 </ds:datastoreItem>
 </file>
 
+<file path=customXml/itemProps3.xml><?xml version="1.0" encoding="utf-8"?>
+<ds:datastoreItem xmlns:ds="http://schemas.openxmlformats.org/officeDocument/2006/customXml" ds:itemID="{DAAF528F-7240-408A-9BF0-E37AC9702D32}">
+  <ds:schemaRefs>
+    <ds:schemaRef ds:uri="http://schemas.microsoft.com/office/2006/metadata/properties"/>
+    <ds:schemaRef ds:uri="http://schemas.microsoft.com/office/infopath/2007/PartnerControls"/>
+    <ds:schemaRef ds:uri="e62bc30b-b884-4ee1-b0ab-e2e35dfacfd5"/>
+  </ds:schemaRefs>
+</ds:datastoreItem>
+</file>
+
 <file path=customXml/itemProps4.xml><?xml version="1.0" encoding="utf-8"?>
-<ds:datastoreItem xmlns:ds="http://schemas.openxmlformats.org/officeDocument/2006/customXml" ds:itemID="{BE0E3CBB-9640-C643-97A5-411B9F838128}">
+<ds:datastoreItem xmlns:ds="http://schemas.openxmlformats.org/officeDocument/2006/customXml" ds:itemID="{7E3075BF-FDAF-4D4D-8DC1-23126609A178}">
   <ds:schemaRefs>
-    <ds:schemaRef ds:uri="http://schemas.openxmlformats.org/officeDocument/2006/bibliography"/>
+    <ds:schemaRef ds:uri="http://schemas.microsoft.com/sharepoint/v3/contenttype/forms"/>
   </ds:schemaRefs>
 </ds:datastoreItem>
 </file>
</xml_diff>

<commit_message>
Ajustes preliminares al informe final
</commit_message>
<xml_diff>
--- a/TP4/TP4_Programacion_Grupo3.docx
+++ b/TP4/TP4_Programacion_Grupo3.docx
@@ -2486,6 +2486,7 @@
                 <w:szCs w:val="20"/>
               </w:rPr>
             </w:pPr>
+            <w:proofErr w:type="spellStart"/>
             <w:r>
               <w:rPr>
                 <w:b/>
@@ -2495,6 +2496,7 @@
               </w:rPr>
               <w:t>Accuacy</w:t>
             </w:r>
+            <w:proofErr w:type="spellEnd"/>
             <w:r>
               <w:rPr>
                 <w:b/>
@@ -4409,6 +4411,7 @@
     <w:p>
       <w:pPr>
         <w:pStyle w:val="Sinespaciado"/>
+        <w:spacing w:after="240"/>
         <w:ind w:left="1843" w:right="1983"/>
       </w:pPr>
       <w:r>
@@ -4463,7 +4466,19 @@
         <w:rPr>
           <w:lang w:val="es-US"/>
         </w:rPr>
-        <w:t>Este código utilicé para el TP3, muéstrame las bases utilizadas y que corresponde a cada una</w:t>
+        <w:t>Este código utilicé para el TP3, muéstrame las bases utilizadas y qu</w:t>
+      </w:r>
+      <w:r>
+        <w:rPr>
+          <w:lang w:val="es-US"/>
+        </w:rPr>
+        <w:t>é</w:t>
+      </w:r>
+      <w:r>
+        <w:rPr>
+          <w:lang w:val="es-US"/>
+        </w:rPr>
+        <w:t xml:space="preserve"> corresponde a cada una</w:t>
       </w:r>
     </w:p>
     <w:p>
@@ -4484,7 +4499,10 @@
     </w:p>
     <w:p>
       <w:r>
-        <w:t xml:space="preserve">Un aspecto que creo que se puede mejorar, es que en la consigna se menciona que se realizará la técnica de </w:t>
+        <w:t>Un aspecto que creo que se puede me</w:t>
+      </w:r>
+      <w:r>
+        <w:t xml:space="preserve">jorar es que en la consigna se menciona que se realizará la técnica de </w:t>
       </w:r>
       <w:proofErr w:type="spellStart"/>
       <w:r>
@@ -4500,20 +4518,54 @@
       </w:r>
       <w:proofErr w:type="spellEnd"/>
       <w:r>
-        <w:t xml:space="preserve"> sobre toda la base, yo creo que eso podría elevar las métricas de precisión finales, </w:t>
-      </w:r>
-      <w:proofErr w:type="spellStart"/>
-      <w:r>
-        <w:t>por que</w:t>
-      </w:r>
-      <w:proofErr w:type="spellEnd"/>
-      <w:r>
-        <w:t xml:space="preserve"> no hay nada contra que comparar. Crees que lo que digo es válido teóricamente?</w:t>
+        <w:t xml:space="preserve"> sobre toda la base; yo creo que eso podría elevar las métricas de precisión finales porque no hay nada con qué</w:t>
+      </w:r>
+      <w:r>
+        <w:t xml:space="preserve"> c</w:t>
+      </w:r>
+      <w:r>
+        <w:t xml:space="preserve">omparar. </w:t>
+      </w:r>
+      <w:r>
+        <w:t>¿</w:t>
+      </w:r>
+      <w:r>
+        <w:t>Crees que lo que digo es teóricamente</w:t>
+      </w:r>
+      <w:r>
+        <w:t xml:space="preserve"> válido</w:t>
+      </w:r>
+      <w:r>
+        <w:t>?</w:t>
       </w:r>
     </w:p>
     <w:p>
       <w:r>
-        <w:t>Perfecto, entonces lo adecuado es trabajar con datos de entrenamiento y testeo, eso es lo primero que quiero que realices, dame el código para eso.</w:t>
+        <w:t xml:space="preserve">Perfecto, entonces lo adecuado es trabajar con datos de entrenamiento y </w:t>
+      </w:r>
+      <w:r>
+        <w:t xml:space="preserve">de </w:t>
+      </w:r>
+      <w:r>
+        <w:t>testeo</w:t>
+      </w:r>
+      <w:r>
+        <w:t>.</w:t>
+      </w:r>
+      <w:r>
+        <w:t xml:space="preserve"> </w:t>
+      </w:r>
+      <w:r>
+        <w:t>E</w:t>
+      </w:r>
+      <w:r>
+        <w:t>so es lo primero que quiero que realices</w:t>
+      </w:r>
+      <w:r>
+        <w:t>;</w:t>
+      </w:r>
+      <w:r>
+        <w:t xml:space="preserve"> dame el código para eso.</w:t>
       </w:r>
     </w:p>
     <w:p>
@@ -4647,7 +4699,19 @@
         <w:rPr>
           <w:lang w:val="es-US"/>
         </w:rPr>
-        <w:t xml:space="preserve"> en los resultados de la última celda del cuaderno.</w:t>
+        <w:t xml:space="preserve"> en la última celda</w:t>
+      </w:r>
+      <w:r>
+        <w:rPr>
+          <w:lang w:val="es-US"/>
+        </w:rPr>
+        <w:t xml:space="preserve"> de los resultados</w:t>
+      </w:r>
+      <w:r>
+        <w:rPr>
+          <w:lang w:val="es-US"/>
+        </w:rPr>
+        <w:t xml:space="preserve"> del cuaderno.</w:t>
       </w:r>
     </w:p>
     <w:p>
@@ -7524,6 +7588,7 @@
     <w:rsid w:val="00700D70"/>
     <w:rsid w:val="0076750D"/>
     <w:rsid w:val="0077239B"/>
+    <w:rsid w:val="007D1196"/>
     <w:rsid w:val="007F3532"/>
     <w:rsid w:val="0082012A"/>
     <w:rsid w:val="008724E2"/>
@@ -7542,7 +7607,6 @@
     <w:rsid w:val="00D348EA"/>
     <w:rsid w:val="00DA4981"/>
     <w:rsid w:val="00DB5DAE"/>
-    <w:rsid w:val="00DE28E6"/>
     <w:rsid w:val="00DF55B8"/>
     <w:rsid w:val="00E05EEF"/>
     <w:rsid w:val="00E305CE"/>

</xml_diff>

<commit_message>
Edición de la redacción del informe final
</commit_message>
<xml_diff>
--- a/TP4/TP4_Programacion_Grupo3.docx
+++ b/TP4/TP4_Programacion_Grupo3.docx
@@ -6104,13 +6104,28 @@
     </w:p>
     <w:p>
       <w:r>
-        <w:t xml:space="preserve">Las curvas ROC de los cuatro modelos evaluados en el conjunto de testeo del estudio se </w:t>
+        <w:t>Los resultados</w:t>
+      </w:r>
+      <w:r>
+        <w:t xml:space="preserve"> que </w:t>
+      </w:r>
+      <w:r>
+        <w:t xml:space="preserve">se </w:t>
       </w:r>
       <w:r>
         <w:t>muestr</w:t>
       </w:r>
       <w:r>
-        <w:t xml:space="preserve">an en la Figura 5. Los resultados son prácticamente idénticos para los </w:t>
+        <w:t>an en la Figura 5</w:t>
+      </w:r>
+      <w:r>
+        <w:t xml:space="preserve"> son prácticamente idénticos </w:t>
+      </w:r>
+      <w:r>
+        <w:t>entre</w:t>
+      </w:r>
+      <w:r>
+        <w:t xml:space="preserve"> los </w:t>
       </w:r>
       <w:r>
         <w:t>cuatro</w:t>
@@ -6398,6 +6413,12 @@
           <w:lang w:val="es-US"/>
         </w:rPr>
         <w:t xml:space="preserve"> ajustes manuales iterativos.</w:t>
+      </w:r>
+      <w:r>
+        <w:rPr>
+          <w:lang w:val="es-US"/>
+        </w:rPr>
+        <w:t xml:space="preserve"> Finalmente, la elaboración del presente informe, incluido el código de Python, tomó alrededor de cinco días, de forma intermitente.</w:t>
       </w:r>
     </w:p>
     <w:p>
@@ -13234,10 +13255,10 @@
     <w:rsid w:val="007F3532"/>
     <w:rsid w:val="0082012A"/>
     <w:rsid w:val="008724E2"/>
+    <w:rsid w:val="00932254"/>
     <w:rsid w:val="009C4132"/>
     <w:rsid w:val="009E0000"/>
     <w:rsid w:val="009F51EB"/>
-    <w:rsid w:val="00A16C02"/>
     <w:rsid w:val="00A2183C"/>
     <w:rsid w:val="00A6776A"/>
     <w:rsid w:val="00A92590"/>

</xml_diff>

<commit_message>
Corrección de la redacción del informe final
</commit_message>
<xml_diff>
--- a/TP4/TP4_Programacion_Grupo3.docx
+++ b/TP4/TP4_Programacion_Grupo3.docx
@@ -388,7 +388,6 @@
           <w:lang w:val="es-ES_tradnl"/>
         </w:rPr>
       </w:pPr>
-      <w:proofErr w:type="spellStart"/>
       <w:r>
         <w:rPr>
           <w:rFonts w:cs="Times New Roman"/>
@@ -401,7 +400,6 @@
         </w:rPr>
         <w:t>Github</w:t>
       </w:r>
-      <w:proofErr w:type="spellEnd"/>
       <w:r>
         <w:rPr>
           <w:rFonts w:cs="Times New Roman"/>
@@ -1083,27 +1081,7 @@
           <w:i/>
           <w:iCs w:val="0"/>
         </w:rPr>
-        <w:t xml:space="preserve">Distribución del error de validación por </w:t>
-      </w:r>
-      <w:proofErr w:type="spellStart"/>
-      <w:r>
-        <w:rPr>
-          <w:b w:val="0"/>
-          <w:bCs/>
-          <w:i/>
-          <w:iCs w:val="0"/>
-        </w:rPr>
-        <w:t>fold</w:t>
-      </w:r>
-      <w:proofErr w:type="spellEnd"/>
-      <w:r>
-        <w:rPr>
-          <w:b w:val="0"/>
-          <w:bCs/>
-          <w:i/>
-          <w:iCs w:val="0"/>
-        </w:rPr>
-        <w:t>- Proporción de variables ignoradas LASSO</w:t>
+        <w:t>Distribución del error de validación por fold- Proporción de variables ignoradas LASSO</w:t>
       </w:r>
     </w:p>
     <w:p>
@@ -1966,14 +1944,12 @@
         </w:rPr>
         <w:t>(</w:t>
       </w:r>
-      <w:proofErr w:type="spellStart"/>
       <w:r>
         <w:rPr>
           <w:lang w:val="es-US"/>
         </w:rPr>
         <w:t>ccp_alpha</w:t>
       </w:r>
-      <w:proofErr w:type="spellEnd"/>
       <w:r>
         <w:rPr>
           <w:lang w:val="es-US"/>
@@ -1998,7 +1974,6 @@
         </w:rPr>
         <w:t xml:space="preserve"> validación cruzada en 5 </w:t>
       </w:r>
-      <w:proofErr w:type="spellStart"/>
       <w:r>
         <w:rPr>
           <w:i/>
@@ -2007,7 +1982,6 @@
         </w:rPr>
         <w:t>folds</w:t>
       </w:r>
-      <w:proofErr w:type="spellEnd"/>
       <w:r>
         <w:rPr>
           <w:lang w:val="es-US"/>
@@ -2042,16 +2016,8 @@
         <w:rPr>
           <w:lang w:val="es-US"/>
         </w:rPr>
-        <w:t xml:space="preserve">s valores de </w:t>
-      </w:r>
-      <w:proofErr w:type="spellStart"/>
-      <w:r>
-        <w:rPr>
-          <w:lang w:val="es-US"/>
-        </w:rPr>
-        <w:t>ccp_alpha</w:t>
-      </w:r>
-      <w:proofErr w:type="spellEnd"/>
+        <w:t>s valores de ccp_alpha</w:t>
+      </w:r>
       <w:r>
         <w:rPr>
           <w:lang w:val="es-US"/>
@@ -2352,7 +2318,6 @@
         </w:rPr>
         <w:t xml:space="preserve"> la trayectoria del error de clasificación en la validación cruzada (5 </w:t>
       </w:r>
-      <w:proofErr w:type="spellStart"/>
       <w:r>
         <w:rPr>
           <w:i/>
@@ -2361,7 +2326,6 @@
         </w:rPr>
         <w:t>folds</w:t>
       </w:r>
-      <w:proofErr w:type="spellEnd"/>
       <w:r>
         <w:rPr>
           <w:lang w:val="es-US"/>
@@ -2410,14 +2374,12 @@
         </w:rPr>
         <w:t>(</w:t>
       </w:r>
-      <w:proofErr w:type="spellStart"/>
       <w:r>
         <w:rPr>
           <w:lang w:val="es-US"/>
         </w:rPr>
         <w:t>ccp_alpha</w:t>
       </w:r>
-      <w:proofErr w:type="spellEnd"/>
       <w:r>
         <w:rPr>
           <w:lang w:val="es-US"/>
@@ -3347,7 +3309,6 @@
         </w:rPr>
         <w:t xml:space="preserve"> conjunto común de métricas de clasificación. Para tal fin se computan, para el umbral de clasificación p = 0,5, la matriz de confusión, la exactitud, la sensibilidad, la especificidad, la precisión, el F1, </w:t>
       </w:r>
-      <w:proofErr w:type="spellStart"/>
       <w:r>
         <w:rPr>
           <w:i/>
@@ -3356,7 +3317,6 @@
         </w:rPr>
         <w:t>accuracy</w:t>
       </w:r>
-      <w:proofErr w:type="spellEnd"/>
       <w:r>
         <w:rPr>
           <w:lang w:val="es-US"/>
@@ -3375,23 +3335,13 @@
         </w:rPr>
         <w:t xml:space="preserve"> se muestran las curvas ROC de cada modelo para visualizar el </w:t>
       </w:r>
-      <w:proofErr w:type="spellStart"/>
       <w:r>
         <w:rPr>
           <w:i/>
           <w:iCs/>
           <w:lang w:val="es-US"/>
         </w:rPr>
-        <w:t>trade</w:t>
-      </w:r>
-      <w:proofErr w:type="spellEnd"/>
-      <w:r>
-        <w:rPr>
-          <w:i/>
-          <w:iCs/>
-          <w:lang w:val="es-US"/>
-        </w:rPr>
-        <w:t>-off</w:t>
+        <w:t>trade-off</w:t>
       </w:r>
       <w:r>
         <w:rPr>
@@ -3562,7 +3512,6 @@
                 <w:szCs w:val="20"/>
               </w:rPr>
             </w:pPr>
-            <w:proofErr w:type="spellStart"/>
             <w:r>
               <w:rPr>
                 <w:b/>
@@ -3572,7 +3521,6 @@
               </w:rPr>
               <w:t>Accuracy</w:t>
             </w:r>
-            <w:proofErr w:type="spellEnd"/>
           </w:p>
         </w:tc>
         <w:tc>
@@ -3606,19 +3554,34 @@
                 <w:sz w:val="16"/>
                 <w:szCs w:val="20"/>
               </w:rPr>
-              <w:t>Sensibilidad (</w:t>
-            </w:r>
-            <w:proofErr w:type="spellStart"/>
-            <w:r>
+              <w:t>Sensibilidad (recall)</w:t>
+            </w:r>
+          </w:p>
+        </w:tc>
+        <w:tc>
+          <w:tcPr>
+            <w:tcW w:w="503" w:type="pct"/>
+            <w:tcBorders>
+              <w:top w:val="single" w:sz="8" w:space="0" w:color="auto"/>
+              <w:left w:val="nil"/>
+              <w:bottom w:val="single" w:sz="4" w:space="0" w:color="auto"/>
+              <w:right w:val="nil"/>
+            </w:tcBorders>
+            <w:noWrap/>
+            <w:vAlign w:val="center"/>
+            <w:hideMark/>
+          </w:tcPr>
+          <w:p>
+            <w:pPr>
+              <w:pStyle w:val="Sinespaciado"/>
+              <w:jc w:val="center"/>
               <w:rPr>
                 <w:b/>
                 <w:bCs/>
                 <w:sz w:val="16"/>
                 <w:szCs w:val="20"/>
               </w:rPr>
-              <w:t>recall</w:t>
-            </w:r>
-            <w:proofErr w:type="spellEnd"/>
+            </w:pPr>
             <w:r>
               <w:rPr>
                 <w:b/>
@@ -3626,13 +3589,13 @@
                 <w:sz w:val="16"/>
                 <w:szCs w:val="20"/>
               </w:rPr>
-              <w:t>)</w:t>
-            </w:r>
-          </w:p>
-        </w:tc>
-        <w:tc>
-          <w:tcPr>
-            <w:tcW w:w="503" w:type="pct"/>
+              <w:t>Especificidad</w:t>
+            </w:r>
+          </w:p>
+        </w:tc>
+        <w:tc>
+          <w:tcPr>
+            <w:tcW w:w="368" w:type="pct"/>
             <w:tcBorders>
               <w:top w:val="single" w:sz="8" w:space="0" w:color="auto"/>
               <w:left w:val="nil"/>
@@ -3661,13 +3624,13 @@
                 <w:sz w:val="16"/>
                 <w:szCs w:val="20"/>
               </w:rPr>
-              <w:t>Especificidad</w:t>
-            </w:r>
-          </w:p>
-        </w:tc>
-        <w:tc>
-          <w:tcPr>
-            <w:tcW w:w="368" w:type="pct"/>
+              <w:t>Precisión</w:t>
+            </w:r>
+          </w:p>
+        </w:tc>
+        <w:tc>
+          <w:tcPr>
+            <w:tcW w:w="277" w:type="pct"/>
             <w:tcBorders>
               <w:top w:val="single" w:sz="8" w:space="0" w:color="auto"/>
               <w:left w:val="nil"/>
@@ -3696,13 +3659,13 @@
                 <w:sz w:val="16"/>
                 <w:szCs w:val="20"/>
               </w:rPr>
-              <w:t>Precisión</w:t>
-            </w:r>
-          </w:p>
-        </w:tc>
-        <w:tc>
-          <w:tcPr>
-            <w:tcW w:w="277" w:type="pct"/>
+              <w:t>F1</w:t>
+            </w:r>
+          </w:p>
+        </w:tc>
+        <w:tc>
+          <w:tcPr>
+            <w:tcW w:w="773" w:type="pct"/>
             <w:tcBorders>
               <w:top w:val="single" w:sz="8" w:space="0" w:color="auto"/>
               <w:left w:val="nil"/>
@@ -3731,45 +3694,8 @@
                 <w:sz w:val="16"/>
                 <w:szCs w:val="20"/>
               </w:rPr>
-              <w:t>F1</w:t>
-            </w:r>
-          </w:p>
-        </w:tc>
-        <w:tc>
-          <w:tcPr>
-            <w:tcW w:w="773" w:type="pct"/>
-            <w:tcBorders>
-              <w:top w:val="single" w:sz="8" w:space="0" w:color="auto"/>
-              <w:left w:val="nil"/>
-              <w:bottom w:val="single" w:sz="4" w:space="0" w:color="auto"/>
-              <w:right w:val="nil"/>
-            </w:tcBorders>
-            <w:noWrap/>
-            <w:vAlign w:val="center"/>
-            <w:hideMark/>
-          </w:tcPr>
-          <w:p>
-            <w:pPr>
-              <w:pStyle w:val="Sinespaciado"/>
-              <w:jc w:val="center"/>
-              <w:rPr>
-                <w:b/>
-                <w:bCs/>
-                <w:sz w:val="16"/>
-                <w:szCs w:val="20"/>
-              </w:rPr>
-            </w:pPr>
-            <w:proofErr w:type="spellStart"/>
-            <w:r>
-              <w:rPr>
-                <w:b/>
-                <w:bCs/>
-                <w:sz w:val="16"/>
-                <w:szCs w:val="20"/>
-              </w:rPr>
               <w:t>Accuacy</w:t>
             </w:r>
-            <w:proofErr w:type="spellEnd"/>
             <w:r>
               <w:rPr>
                 <w:b/>
@@ -5621,7 +5547,6 @@
         </w:rPr>
         <w:t xml:space="preserve"> sin olvidar que la diferencia en el porcentaje de </w:t>
       </w:r>
-      <w:proofErr w:type="spellStart"/>
       <w:r>
         <w:rPr>
           <w:i/>
@@ -5630,7 +5555,6 @@
         </w:rPr>
         <w:t>accuracy</w:t>
       </w:r>
-      <w:proofErr w:type="spellEnd"/>
       <w:r>
         <w:rPr>
           <w:lang w:val="es-US"/>
@@ -5659,21 +5583,7 @@
         <w:rPr>
           <w:lang w:val="es-US"/>
         </w:rPr>
-        <w:t xml:space="preserve"> 0,9026, lo que hace que tenga un error de clasificación (1 − </w:t>
-      </w:r>
-      <w:proofErr w:type="spellStart"/>
-      <w:r>
-        <w:rPr>
-          <w:lang w:val="es-US"/>
-        </w:rPr>
-        <w:t>accuracy</w:t>
-      </w:r>
-      <w:proofErr w:type="spellEnd"/>
-      <w:r>
-        <w:rPr>
-          <w:lang w:val="es-US"/>
-        </w:rPr>
-        <w:t xml:space="preserve">) de 0,0974 respecto al 0,0934 del </w:t>
+        <w:t xml:space="preserve"> 0,9026, lo que hace que tenga un error de clasificación (1 − accuracy) de 0,0974 respecto al 0,0934 del </w:t>
       </w:r>
       <w:r>
         <w:rPr>
@@ -5709,21 +5619,7 @@
         <w:rPr>
           <w:lang w:val="es-US"/>
         </w:rPr>
-        <w:t xml:space="preserve"> que los </w:t>
-      </w:r>
-      <w:proofErr w:type="spellStart"/>
-      <w:r>
-        <w:rPr>
-          <w:lang w:val="es-US"/>
-        </w:rPr>
-        <w:t>logits</w:t>
-      </w:r>
-      <w:proofErr w:type="spellEnd"/>
-      <w:r>
-        <w:rPr>
-          <w:lang w:val="es-US"/>
-        </w:rPr>
-        <w:t xml:space="preserve"> alcanzan hasta el 46,25%</w:t>
+        <w:t xml:space="preserve"> que los logits alcanzan hasta el 46,25%</w:t>
       </w:r>
       <w:r>
         <w:rPr>
@@ -5912,23 +5808,13 @@
         </w:rPr>
         <w:t xml:space="preserve">a. Este </w:t>
       </w:r>
-      <w:proofErr w:type="spellStart"/>
       <w:r>
         <w:rPr>
           <w:i/>
           <w:iCs/>
           <w:lang w:val="es-US"/>
         </w:rPr>
-        <w:t>trade</w:t>
-      </w:r>
-      <w:proofErr w:type="spellEnd"/>
-      <w:r>
-        <w:rPr>
-          <w:i/>
-          <w:iCs/>
-          <w:lang w:val="es-US"/>
-        </w:rPr>
-        <w:t>-off</w:t>
+        <w:t>trade-off</w:t>
       </w:r>
       <w:r>
         <w:rPr>
@@ -6314,21 +6200,7 @@
         <w:rPr>
           <w:lang w:val="es-US"/>
         </w:rPr>
-        <w:t xml:space="preserve">l código para la regularización Ridge y LASSO, el 5-fold </w:t>
-      </w:r>
-      <w:proofErr w:type="spellStart"/>
-      <w:r>
-        <w:rPr>
-          <w:lang w:val="es-US"/>
-        </w:rPr>
-        <w:t>cross-validation</w:t>
-      </w:r>
-      <w:proofErr w:type="spellEnd"/>
-      <w:r>
-        <w:rPr>
-          <w:lang w:val="es-US"/>
-        </w:rPr>
-        <w:t xml:space="preserve">, la construcción del árbol CART con el ajuste del hiperparámetro óptimo y en la orientación para decisiones metodológicas clave como la incorporación de un conjunto de testeo para evitar la sobreestimación de las propias métricas de desempeño. Hubo también cierta contribución de la IA en la interpretación de resultados </w:t>
+        <w:t xml:space="preserve">l código para la regularización Ridge y LASSO, el 5-fold cross-validation, la construcción del árbol CART con el ajuste del hiperparámetro óptimo y en la orientación para decisiones metodológicas clave como la incorporación de un conjunto de testeo para evitar la sobreestimación de las propias métricas de desempeño. Hubo también cierta contribución de la IA en la interpretación de resultados </w:t>
       </w:r>
       <w:r>
         <w:rPr>
@@ -6418,7 +6290,19 @@
         <w:rPr>
           <w:lang w:val="es-US"/>
         </w:rPr>
-        <w:t xml:space="preserve"> Finalmente, la elaboración del presente informe, incluido el código de Python, tomó alrededor de cinco días, de forma intermitente.</w:t>
+        <w:t xml:space="preserve"> Finalmente, la elaboración del presente informe, incluido el código de Python, tomó alrededor de cinco días, de forma intermitente</w:t>
+      </w:r>
+      <w:r>
+        <w:rPr>
+          <w:lang w:val="es-US"/>
+        </w:rPr>
+        <w:t>, lo que supuso un total de 18 horas</w:t>
+      </w:r>
+      <w:r>
+        <w:rPr>
+          <w:lang w:val="es-US"/>
+        </w:rPr>
+        <w:t>.</w:t>
       </w:r>
     </w:p>
     <w:p>
@@ -10057,7 +9941,6 @@
       <w:r>
         <w:t xml:space="preserve">Para el desarrollo del presente informe se consideraron los siguientes </w:t>
       </w:r>
-      <w:proofErr w:type="spellStart"/>
       <w:r>
         <w:rPr>
           <w:i/>
@@ -10065,7 +9948,6 @@
         </w:rPr>
         <w:t>prompts</w:t>
       </w:r>
-      <w:proofErr w:type="spellEnd"/>
       <w:r>
         <w:t xml:space="preserve"> de inteligencia artificial, lo que agilizó </w:t>
       </w:r>
@@ -10087,7 +9969,6 @@
       <w:r>
         <w:t xml:space="preserve">ron a la inteligencia artificial con el objetivo de mejorar la comprensión del análisis general. A continuación, se detallan los </w:t>
       </w:r>
-      <w:proofErr w:type="spellStart"/>
       <w:r>
         <w:rPr>
           <w:i/>
@@ -10095,7 +9976,6 @@
         </w:rPr>
         <w:t>prompts</w:t>
       </w:r>
-      <w:proofErr w:type="spellEnd"/>
       <w:r>
         <w:t xml:space="preserve"> más importantes en materia del diseño operativo anteriormente mencionado:</w:t>
       </w:r>
@@ -10217,23 +10097,7 @@
         </w:numPr>
       </w:pPr>
       <w:r>
-        <w:t xml:space="preserve">Un aspecto que creo que se puede mejorar es que en la consigna se menciona que se realizará la técnica de </w:t>
-      </w:r>
-      <w:proofErr w:type="spellStart"/>
-      <w:r>
-        <w:t>cross</w:t>
-      </w:r>
-      <w:proofErr w:type="spellEnd"/>
-      <w:r>
-        <w:t xml:space="preserve"> </w:t>
-      </w:r>
-      <w:proofErr w:type="spellStart"/>
-      <w:r>
-        <w:t>validation</w:t>
-      </w:r>
-      <w:proofErr w:type="spellEnd"/>
-      <w:r>
-        <w:t xml:space="preserve"> sobre toda la base; yo creo que eso podría elevar las métricas de precisión finales porque no hay nada con qué comparar. ¿Crees que lo que digo es teóricamente válido?</w:t>
+        <w:t>Un aspecto que creo que se puede mejorar es que en la consigna se menciona que se realizará la técnica de cross validation sobre toda la base; yo creo que eso podría elevar las métricas de precisión finales porque no hay nada con qué comparar. ¿Crees que lo que digo es teóricamente válido?</w:t>
       </w:r>
     </w:p>
     <w:p>
@@ -10313,7 +10177,6 @@
       <w:r>
         <w:t xml:space="preserve"> utiliza el siguiente número de </w:t>
       </w:r>
-      <w:proofErr w:type="spellStart"/>
       <w:r>
         <w:rPr>
           <w:i/>
@@ -10321,7 +10184,6 @@
         </w:rPr>
         <w:t>folds</w:t>
       </w:r>
-      <w:proofErr w:type="spellEnd"/>
       <w:r>
         <w:rPr>
           <w:i/>
@@ -13255,7 +13117,6 @@
     <w:rsid w:val="007F3532"/>
     <w:rsid w:val="0082012A"/>
     <w:rsid w:val="008724E2"/>
-    <w:rsid w:val="00932254"/>
     <w:rsid w:val="009C4132"/>
     <w:rsid w:val="009E0000"/>
     <w:rsid w:val="009F51EB"/>
@@ -13265,6 +13126,7 @@
     <w:rsid w:val="00AC13E3"/>
     <w:rsid w:val="00AF2C96"/>
     <w:rsid w:val="00B0692D"/>
+    <w:rsid w:val="00B42F81"/>
     <w:rsid w:val="00CF0229"/>
     <w:rsid w:val="00D14777"/>
     <w:rsid w:val="00D326F3"/>

</xml_diff>

<commit_message>
Creación y construcción del archivo de la presentación
</commit_message>
<xml_diff>
--- a/TP4/TP4_Programacion_Grupo3.docx
+++ b/TP4/TP4_Programacion_Grupo3.docx
@@ -388,6 +388,7 @@
           <w:lang w:val="es-ES_tradnl"/>
         </w:rPr>
       </w:pPr>
+      <w:proofErr w:type="spellStart"/>
       <w:r>
         <w:rPr>
           <w:rFonts w:cs="Times New Roman"/>
@@ -400,6 +401,7 @@
         </w:rPr>
         <w:t>Github</w:t>
       </w:r>
+      <w:proofErr w:type="spellEnd"/>
       <w:r>
         <w:rPr>
           <w:rFonts w:cs="Times New Roman"/>
@@ -1081,7 +1083,27 @@
           <w:i/>
           <w:iCs w:val="0"/>
         </w:rPr>
-        <w:t>Distribución del error de validación por fold- Proporción de variables ignoradas LASSO</w:t>
+        <w:t xml:space="preserve">Distribución del error de validación por </w:t>
+      </w:r>
+      <w:proofErr w:type="spellStart"/>
+      <w:r>
+        <w:rPr>
+          <w:b w:val="0"/>
+          <w:bCs/>
+          <w:i/>
+          <w:iCs w:val="0"/>
+        </w:rPr>
+        <w:t>fold</w:t>
+      </w:r>
+      <w:proofErr w:type="spellEnd"/>
+      <w:r>
+        <w:rPr>
+          <w:b w:val="0"/>
+          <w:bCs/>
+          <w:i/>
+          <w:iCs w:val="0"/>
+        </w:rPr>
+        <w:t>- Proporción de variables ignoradas LASSO</w:t>
       </w:r>
     </w:p>
     <w:p>
@@ -1545,8 +1567,8 @@
           <w:noProof/>
         </w:rPr>
         <w:drawing>
-          <wp:inline distT="0" distB="0" distL="0" distR="0" wp14:anchorId="4CB65634" wp14:editId="76BA229F">
-            <wp:extent cx="4692216" cy="1837055"/>
+          <wp:inline distT="0" distB="0" distL="0" distR="0" wp14:anchorId="4CB65634" wp14:editId="472B176C">
+            <wp:extent cx="4692015" cy="1710266"/>
             <wp:effectExtent l="0" t="0" r="0" b="4445"/>
             <wp:docPr id="6" name="Imagen 6"/>
             <wp:cNvGraphicFramePr>
@@ -1577,7 +1599,7 @@
                   <pic:spPr bwMode="auto">
                     <a:xfrm>
                       <a:off x="0" y="0"/>
-                      <a:ext cx="4941096" cy="1934494"/>
+                      <a:ext cx="4943524" cy="1801942"/>
                     </a:xfrm>
                     <a:prstGeom prst="rect">
                       <a:avLst/>
@@ -1625,6 +1647,18 @@
         </w:rPr>
         <w:t xml:space="preserve"> INDEC (2026).</w:t>
       </w:r>
+      <w:r>
+        <w:rPr>
+          <w:lang w:val="es-US"/>
+        </w:rPr>
+        <w:t xml:space="preserve"> EMP hace referencia al Efecto Marginal Promedio</w:t>
+      </w:r>
+      <w:r>
+        <w:rPr>
+          <w:lang w:val="es-US"/>
+        </w:rPr>
+        <w:t>.</w:t>
+      </w:r>
     </w:p>
     <w:p>
       <w:pPr>
@@ -1944,12 +1978,14 @@
         </w:rPr>
         <w:t>(</w:t>
       </w:r>
+      <w:proofErr w:type="spellStart"/>
       <w:r>
         <w:rPr>
           <w:lang w:val="es-US"/>
         </w:rPr>
         <w:t>ccp_alpha</w:t>
       </w:r>
+      <w:proofErr w:type="spellEnd"/>
       <w:r>
         <w:rPr>
           <w:lang w:val="es-US"/>
@@ -1974,6 +2010,7 @@
         </w:rPr>
         <w:t xml:space="preserve"> validación cruzada en 5 </w:t>
       </w:r>
+      <w:proofErr w:type="spellStart"/>
       <w:r>
         <w:rPr>
           <w:i/>
@@ -1982,6 +2019,7 @@
         </w:rPr>
         <w:t>folds</w:t>
       </w:r>
+      <w:proofErr w:type="spellEnd"/>
       <w:r>
         <w:rPr>
           <w:lang w:val="es-US"/>
@@ -2016,8 +2054,16 @@
         <w:rPr>
           <w:lang w:val="es-US"/>
         </w:rPr>
-        <w:t>s valores de ccp_alpha</w:t>
-      </w:r>
+        <w:t xml:space="preserve">s valores de </w:t>
+      </w:r>
+      <w:proofErr w:type="spellStart"/>
+      <w:r>
+        <w:rPr>
+          <w:lang w:val="es-US"/>
+        </w:rPr>
+        <w:t>ccp_alpha</w:t>
+      </w:r>
+      <w:proofErr w:type="spellEnd"/>
       <w:r>
         <w:rPr>
           <w:lang w:val="es-US"/>
@@ -2318,6 +2364,7 @@
         </w:rPr>
         <w:t xml:space="preserve"> la trayectoria del error de clasificación en la validación cruzada (5 </w:t>
       </w:r>
+      <w:proofErr w:type="spellStart"/>
       <w:r>
         <w:rPr>
           <w:i/>
@@ -2326,6 +2373,7 @@
         </w:rPr>
         <w:t>folds</w:t>
       </w:r>
+      <w:proofErr w:type="spellEnd"/>
       <w:r>
         <w:rPr>
           <w:lang w:val="es-US"/>
@@ -2374,12 +2422,14 @@
         </w:rPr>
         <w:t>(</w:t>
       </w:r>
+      <w:proofErr w:type="spellStart"/>
       <w:r>
         <w:rPr>
           <w:lang w:val="es-US"/>
         </w:rPr>
         <w:t>ccp_alpha</w:t>
       </w:r>
+      <w:proofErr w:type="spellEnd"/>
       <w:r>
         <w:rPr>
           <w:lang w:val="es-US"/>
@@ -2570,19 +2620,7 @@
         <w:rPr>
           <w:lang w:val="es-US"/>
         </w:rPr>
-        <w:t>lo que reduce el error de validación hasta alcanzar un mínimo de aproximadamente 0,0015 en la grilla de hiperparámetro</w:t>
-      </w:r>
-      <w:r>
-        <w:rPr>
-          <w:lang w:val="es-US"/>
-        </w:rPr>
-        <w:t>s</w:t>
-      </w:r>
-      <w:r>
-        <w:rPr>
-          <w:lang w:val="es-US"/>
-        </w:rPr>
-        <w:t xml:space="preserve"> de poda; desde e</w:t>
+        <w:t>lo que reduce el error de validación hasta alcanzar un mínimo de aproximadamente 0,0015 en la grilla de hiperparámetros de poda; desde e</w:t>
       </w:r>
       <w:r>
         <w:rPr>
@@ -3015,13 +3053,7 @@
         <w:rPr>
           <w:lang w:val="es-US"/>
         </w:rPr>
-        <w:t xml:space="preserve">temporal de este fenómeno, ya corroborada </w:t>
-      </w:r>
-      <w:r>
-        <w:rPr>
-          <w:lang w:val="es-US"/>
-        </w:rPr>
-        <w:t>por</w:t>
+        <w:t>temporal de este fenómeno, ya corroborada por</w:t>
       </w:r>
       <w:r>
         <w:rPr>
@@ -3208,7 +3240,31 @@
         <w:rPr>
           <w:lang w:val="es-EC" w:eastAsia="es-MX"/>
         </w:rPr>
-        <w:t xml:space="preserve"> a cero revela que, debido al bajo valor óptimo de λ obtenido mediante validación cruzada (λ=0,0001), LASSO no anuló ninguna de las 18 variables del modelo, ya que todos los predictores mantuvieron coeficientes distintos de cero. Por consiguiente, no se observa una correspondencia directa entre los criterios de selección: el árbol excluye variables que no resultan discriminativas en las particiones binarias, mientras que LASSO, con la penalidad óptima, retiene aquellas con mayor capacidad explicativa, aunque ello implique </w:t>
+        <w:t xml:space="preserve"> a cero revela que, debido al bajo valor óptimo de λ obtenido mediante validación cruzada (λ</w:t>
+      </w:r>
+      <w:r>
+        <w:rPr>
+          <w:lang w:val="es-EC" w:eastAsia="es-MX"/>
+        </w:rPr>
+        <w:t xml:space="preserve"> </w:t>
+      </w:r>
+      <w:r>
+        <w:rPr>
+          <w:lang w:val="es-EC" w:eastAsia="es-MX"/>
+        </w:rPr>
+        <w:t>=</w:t>
+      </w:r>
+      <w:r>
+        <w:rPr>
+          <w:lang w:val="es-EC" w:eastAsia="es-MX"/>
+        </w:rPr>
+        <w:t xml:space="preserve"> </w:t>
+      </w:r>
+      <w:r>
+        <w:rPr>
+          <w:lang w:val="es-EC" w:eastAsia="es-MX"/>
+        </w:rPr>
+        <w:t xml:space="preserve">0,0001), LASSO no anuló ninguna de las 18 variables del modelo, ya que todos los predictores mantuvieron coeficientes distintos de cero. Por consiguiente, no se observa una correspondencia directa entre los criterios de selección: el árbol excluye variables que no resultan discriminativas en las particiones binarias, mientras que LASSO, con la penalidad óptima, retiene aquellas con mayor capacidad explicativa, aunque ello implique </w:t>
       </w:r>
       <w:r>
         <w:rPr>
@@ -3309,6 +3365,7 @@
         </w:rPr>
         <w:t xml:space="preserve"> conjunto común de métricas de clasificación. Para tal fin se computan, para el umbral de clasificación p = 0,5, la matriz de confusión, la exactitud, la sensibilidad, la especificidad, la precisión, el F1, </w:t>
       </w:r>
+      <w:proofErr w:type="spellStart"/>
       <w:r>
         <w:rPr>
           <w:i/>
@@ -3317,6 +3374,7 @@
         </w:rPr>
         <w:t>accuracy</w:t>
       </w:r>
+      <w:proofErr w:type="spellEnd"/>
       <w:r>
         <w:rPr>
           <w:lang w:val="es-US"/>
@@ -3335,13 +3393,23 @@
         </w:rPr>
         <w:t xml:space="preserve"> se muestran las curvas ROC de cada modelo para visualizar el </w:t>
       </w:r>
+      <w:proofErr w:type="spellStart"/>
       <w:r>
         <w:rPr>
           <w:i/>
           <w:iCs/>
           <w:lang w:val="es-US"/>
         </w:rPr>
-        <w:t>trade-off</w:t>
+        <w:t>trade</w:t>
+      </w:r>
+      <w:proofErr w:type="spellEnd"/>
+      <w:r>
+        <w:rPr>
+          <w:i/>
+          <w:iCs/>
+          <w:lang w:val="es-US"/>
+        </w:rPr>
+        <w:t>-off</w:t>
       </w:r>
       <w:r>
         <w:rPr>
@@ -3512,6 +3580,7 @@
                 <w:szCs w:val="20"/>
               </w:rPr>
             </w:pPr>
+            <w:proofErr w:type="spellStart"/>
             <w:r>
               <w:rPr>
                 <w:b/>
@@ -3521,6 +3590,7 @@
               </w:rPr>
               <w:t>Accuracy</w:t>
             </w:r>
+            <w:proofErr w:type="spellEnd"/>
           </w:p>
         </w:tc>
         <w:tc>
@@ -3554,7 +3624,27 @@
                 <w:sz w:val="16"/>
                 <w:szCs w:val="20"/>
               </w:rPr>
-              <w:t>Sensibilidad (recall)</w:t>
+              <w:t>Sensibilidad (</w:t>
+            </w:r>
+            <w:proofErr w:type="spellStart"/>
+            <w:r>
+              <w:rPr>
+                <w:b/>
+                <w:bCs/>
+                <w:sz w:val="16"/>
+                <w:szCs w:val="20"/>
+              </w:rPr>
+              <w:t>recall</w:t>
+            </w:r>
+            <w:proofErr w:type="spellEnd"/>
+            <w:r>
+              <w:rPr>
+                <w:b/>
+                <w:bCs/>
+                <w:sz w:val="16"/>
+                <w:szCs w:val="20"/>
+              </w:rPr>
+              <w:t>)</w:t>
             </w:r>
           </w:p>
         </w:tc>
@@ -3687,6 +3777,7 @@
                 <w:szCs w:val="20"/>
               </w:rPr>
             </w:pPr>
+            <w:proofErr w:type="spellStart"/>
             <w:r>
               <w:rPr>
                 <w:b/>
@@ -3696,6 +3787,7 @@
               </w:rPr>
               <w:t>Accuacy</w:t>
             </w:r>
+            <w:proofErr w:type="spellEnd"/>
             <w:r>
               <w:rPr>
                 <w:b/>
@@ -5547,6 +5639,7 @@
         </w:rPr>
         <w:t xml:space="preserve"> sin olvidar que la diferencia en el porcentaje de </w:t>
       </w:r>
+      <w:proofErr w:type="spellStart"/>
       <w:r>
         <w:rPr>
           <w:i/>
@@ -5555,6 +5648,7 @@
         </w:rPr>
         <w:t>accuracy</w:t>
       </w:r>
+      <w:proofErr w:type="spellEnd"/>
       <w:r>
         <w:rPr>
           <w:lang w:val="es-US"/>
@@ -5583,7 +5677,21 @@
         <w:rPr>
           <w:lang w:val="es-US"/>
         </w:rPr>
-        <w:t xml:space="preserve"> 0,9026, lo que hace que tenga un error de clasificación (1 − accuracy) de 0,0974 respecto al 0,0934 del </w:t>
+        <w:t xml:space="preserve"> 0,9026, lo que hace que tenga un error de clasificación (1 − </w:t>
+      </w:r>
+      <w:proofErr w:type="spellStart"/>
+      <w:r>
+        <w:rPr>
+          <w:lang w:val="es-US"/>
+        </w:rPr>
+        <w:t>accuracy</w:t>
+      </w:r>
+      <w:proofErr w:type="spellEnd"/>
+      <w:r>
+        <w:rPr>
+          <w:lang w:val="es-US"/>
+        </w:rPr>
+        <w:t xml:space="preserve">) de 0,0974 respecto al 0,0934 del </w:t>
       </w:r>
       <w:r>
         <w:rPr>
@@ -5619,7 +5727,21 @@
         <w:rPr>
           <w:lang w:val="es-US"/>
         </w:rPr>
-        <w:t xml:space="preserve"> que los logits alcanzan hasta el 46,25%</w:t>
+        <w:t xml:space="preserve"> que los </w:t>
+      </w:r>
+      <w:proofErr w:type="spellStart"/>
+      <w:r>
+        <w:rPr>
+          <w:lang w:val="es-US"/>
+        </w:rPr>
+        <w:t>logits</w:t>
+      </w:r>
+      <w:proofErr w:type="spellEnd"/>
+      <w:r>
+        <w:rPr>
+          <w:lang w:val="es-US"/>
+        </w:rPr>
+        <w:t xml:space="preserve"> alcanzan hasta el 46,25%</w:t>
       </w:r>
       <w:r>
         <w:rPr>
@@ -5808,13 +5930,23 @@
         </w:rPr>
         <w:t xml:space="preserve">a. Este </w:t>
       </w:r>
+      <w:proofErr w:type="spellStart"/>
       <w:r>
         <w:rPr>
           <w:i/>
           <w:iCs/>
           <w:lang w:val="es-US"/>
         </w:rPr>
-        <w:t>trade-off</w:t>
+        <w:t>trade</w:t>
+      </w:r>
+      <w:proofErr w:type="spellEnd"/>
+      <w:r>
+        <w:rPr>
+          <w:i/>
+          <w:iCs/>
+          <w:lang w:val="es-US"/>
+        </w:rPr>
+        <w:t>-off</w:t>
       </w:r>
       <w:r>
         <w:rPr>
@@ -5878,6 +6010,9 @@
         <w:fldChar w:fldCharType="separate"/>
       </w:r>
       <w:r>
+        <w:rPr>
+          <w:noProof/>
+        </w:rPr>
         <w:t>5</w:t>
       </w:r>
       <w:r>
@@ -6023,10 +6158,7 @@
         <w:t>(</w:t>
       </w:r>
       <w:r>
-        <w:t>Logit</w:t>
-      </w:r>
-      <w:r>
-        <w:t>, sin penalidad, LASSO y Ridge</w:t>
+        <w:t>Logit, sin penalidad, LASSO y Ridge</w:t>
       </w:r>
       <w:r>
         <w:t>)</w:t>
@@ -6035,28 +6167,7 @@
         <w:t xml:space="preserve">, </w:t>
       </w:r>
       <w:r>
-        <w:t>pues</w:t>
-      </w:r>
-      <w:r>
-        <w:t xml:space="preserve"> todos</w:t>
-      </w:r>
-      <w:r>
-        <w:t xml:space="preserve"> presentan</w:t>
-      </w:r>
-      <w:r>
-        <w:t xml:space="preserve"> un AUC-ROC de 0,862, lo que indica una capacidad discriminante claramente </w:t>
-      </w:r>
-      <w:r>
-        <w:t>superi</w:t>
-      </w:r>
-      <w:r>
-        <w:t xml:space="preserve">or </w:t>
-      </w:r>
-      <w:r>
-        <w:t>a</w:t>
-      </w:r>
-      <w:r>
-        <w:t xml:space="preserve"> la del</w:t>
+        <w:t>pues todos presentan un AUC-ROC de 0,862, lo que indica una capacidad discriminante claramente superior a la del</w:t>
       </w:r>
       <w:r>
         <w:t xml:space="preserve"> clasificador aleatorio. En cambio, el árbol de decisión se queda lejos, con un AUC de 0,790, lo que refuerza lo </w:t>
@@ -6200,19 +6311,27 @@
         <w:rPr>
           <w:lang w:val="es-US"/>
         </w:rPr>
-        <w:t xml:space="preserve">l código para la regularización Ridge y LASSO, el 5-fold cross-validation, la construcción del árbol CART con el ajuste del hiperparámetro óptimo y en la orientación para decisiones metodológicas clave como la incorporación de un conjunto de testeo para evitar la sobreestimación de las propias métricas de desempeño. Hubo también cierta contribución de la IA en la interpretación de resultados </w:t>
-      </w:r>
-      <w:r>
-        <w:rPr>
-          <w:lang w:val="es-US"/>
-        </w:rPr>
-        <w:t>—</w:t>
-      </w:r>
-      <w:r>
-        <w:rPr>
-          <w:lang w:val="es-US"/>
-        </w:rPr>
-        <w:t xml:space="preserve">en </w:t>
+        <w:t xml:space="preserve">l código para la regularización Ridge y LASSO, el 5-fold </w:t>
+      </w:r>
+      <w:proofErr w:type="spellStart"/>
+      <w:r>
+        <w:rPr>
+          <w:lang w:val="es-US"/>
+        </w:rPr>
+        <w:t>cross-validation</w:t>
+      </w:r>
+      <w:proofErr w:type="spellEnd"/>
+      <w:r>
+        <w:rPr>
+          <w:lang w:val="es-US"/>
+        </w:rPr>
+        <w:t xml:space="preserve">, la construcción del árbol CART con el ajuste del hiperparámetro óptimo y en la orientación para decisiones metodológicas clave como la incorporación de un conjunto de testeo para evitar la sobreestimación de las propias métricas de desempeño. Hubo también cierta contribución de la IA en la interpretación de resultados </w:t>
+      </w:r>
+      <w:r>
+        <w:rPr>
+          <w:lang w:val="es-US"/>
+        </w:rPr>
+        <w:t xml:space="preserve">—en </w:t>
       </w:r>
       <w:r>
         <w:rPr>
@@ -6224,13 +6343,7 @@
         <w:rPr>
           <w:lang w:val="es-US"/>
         </w:rPr>
-        <w:t xml:space="preserve"> en casos en los que su desarrollo era iterativo</w:t>
-      </w:r>
-      <w:r>
-        <w:rPr>
-          <w:lang w:val="es-US"/>
-        </w:rPr>
-        <w:t>—</w:t>
+        <w:t xml:space="preserve"> en casos en los que su desarrollo era iterativo—</w:t>
       </w:r>
       <w:r>
         <w:rPr>
@@ -9941,6 +10054,7 @@
       <w:r>
         <w:t xml:space="preserve">Para el desarrollo del presente informe se consideraron los siguientes </w:t>
       </w:r>
+      <w:proofErr w:type="spellStart"/>
       <w:r>
         <w:rPr>
           <w:i/>
@@ -9948,6 +10062,7 @@
         </w:rPr>
         <w:t>prompts</w:t>
       </w:r>
+      <w:proofErr w:type="spellEnd"/>
       <w:r>
         <w:t xml:space="preserve"> de inteligencia artificial, lo que agilizó </w:t>
       </w:r>
@@ -9969,6 +10084,7 @@
       <w:r>
         <w:t xml:space="preserve">ron a la inteligencia artificial con el objetivo de mejorar la comprensión del análisis general. A continuación, se detallan los </w:t>
       </w:r>
+      <w:proofErr w:type="spellStart"/>
       <w:r>
         <w:rPr>
           <w:i/>
@@ -9976,6 +10092,7 @@
         </w:rPr>
         <w:t>prompts</w:t>
       </w:r>
+      <w:proofErr w:type="spellEnd"/>
       <w:r>
         <w:t xml:space="preserve"> más importantes en materia del diseño operativo anteriormente mencionado:</w:t>
       </w:r>
@@ -9995,49 +10112,7 @@
         <w:rPr>
           <w:lang w:val="es-US"/>
         </w:rPr>
-        <w:t>Utilicé</w:t>
-      </w:r>
-      <w:r>
-        <w:rPr>
-          <w:lang w:val="es-US"/>
-        </w:rPr>
-        <w:t xml:space="preserve"> </w:t>
-      </w:r>
-      <w:r>
-        <w:rPr>
-          <w:lang w:val="es-US"/>
-        </w:rPr>
-        <w:t>este código</w:t>
-      </w:r>
-      <w:r>
-        <w:rPr>
-          <w:lang w:val="es-US"/>
-        </w:rPr>
-        <w:t xml:space="preserve"> para el TP3</w:t>
-      </w:r>
-      <w:r>
-        <w:rPr>
-          <w:lang w:val="es-US"/>
-        </w:rPr>
-        <w:t>.</w:t>
-      </w:r>
-      <w:r>
-        <w:rPr>
-          <w:lang w:val="es-US"/>
-        </w:rPr>
-        <w:t xml:space="preserve"> </w:t>
-      </w:r>
-      <w:r>
-        <w:rPr>
-          <w:lang w:val="es-US"/>
-        </w:rPr>
-        <w:t>M</w:t>
-      </w:r>
-      <w:r>
-        <w:rPr>
-          <w:lang w:val="es-US"/>
-        </w:rPr>
-        <w:t>uéstrame las bases utilizadas y qué corresponde a cada una.</w:t>
+        <w:t>Utilicé este código para el TP3. Muéstrame las bases utilizadas y qué corresponde a cada una.</w:t>
       </w:r>
     </w:p>
     <w:p>
@@ -10097,7 +10172,23 @@
         </w:numPr>
       </w:pPr>
       <w:r>
-        <w:t>Un aspecto que creo que se puede mejorar es que en la consigna se menciona que se realizará la técnica de cross validation sobre toda la base; yo creo que eso podría elevar las métricas de precisión finales porque no hay nada con qué comparar. ¿Crees que lo que digo es teóricamente válido?</w:t>
+        <w:t xml:space="preserve">Un aspecto que creo que se puede mejorar es que en la consigna se menciona que se realizará la técnica de </w:t>
+      </w:r>
+      <w:proofErr w:type="spellStart"/>
+      <w:r>
+        <w:t>cross</w:t>
+      </w:r>
+      <w:proofErr w:type="spellEnd"/>
+      <w:r>
+        <w:t xml:space="preserve"> </w:t>
+      </w:r>
+      <w:proofErr w:type="spellStart"/>
+      <w:r>
+        <w:t>validation</w:t>
+      </w:r>
+      <w:proofErr w:type="spellEnd"/>
+      <w:r>
+        <w:t xml:space="preserve"> sobre toda la base; yo creo que eso podría elevar las métricas de precisión finales porque no hay nada con qué comparar. ¿Crees que lo que digo es teóricamente válido?</w:t>
       </w:r>
     </w:p>
     <w:p>
@@ -10177,6 +10268,7 @@
       <w:r>
         <w:t xml:space="preserve"> utiliza el siguiente número de </w:t>
       </w:r>
+      <w:proofErr w:type="spellStart"/>
       <w:r>
         <w:rPr>
           <w:i/>
@@ -10184,6 +10276,7 @@
         </w:rPr>
         <w:t>folds</w:t>
       </w:r>
+      <w:proofErr w:type="spellEnd"/>
       <w:r>
         <w:rPr>
           <w:i/>
@@ -13086,10 +13179,12 @@
     <w:rsid w:val="000745AB"/>
     <w:rsid w:val="000E1D5D"/>
     <w:rsid w:val="00105A3C"/>
+    <w:rsid w:val="00111A12"/>
     <w:rsid w:val="00117038"/>
     <w:rsid w:val="00133A33"/>
     <w:rsid w:val="001C47A7"/>
     <w:rsid w:val="001F051B"/>
+    <w:rsid w:val="0029535B"/>
     <w:rsid w:val="002F4909"/>
     <w:rsid w:val="003021D5"/>
     <w:rsid w:val="00324918"/>
@@ -13126,7 +13221,8 @@
     <w:rsid w:val="00AC13E3"/>
     <w:rsid w:val="00AF2C96"/>
     <w:rsid w:val="00B0692D"/>
-    <w:rsid w:val="00B42F81"/>
+    <w:rsid w:val="00B539B5"/>
+    <w:rsid w:val="00BF73CB"/>
     <w:rsid w:val="00CF0229"/>
     <w:rsid w:val="00D14777"/>
     <w:rsid w:val="00D326F3"/>

</xml_diff>